<commit_message>
chore(02.4): clean up ground-truth archives, update test suite, and add phase planning docs
Remove obsolete ground-truth archive directories (backup_original, updated, updated_v2,
test-cases-old, test-cases-old-new), validation scripts, and summary docs. Update 14
benchmark JSONL files with refined test cases. Add Phase 2.3 UAT and Phase 2.4 planning
documents. Update scoring service and tests. Include term2-mid report updates.

Co-Authored-By: Claude Opus 4.6 <noreply@anthropic.com>
</commit_message>
<xml_diff>
--- a/report/term2-mid/CCOP-PRIMUS-TERM2-MID-SagarPratapSingh-1010736.docx
+++ b/report/term2-mid/CCOP-PRIMUS-TERM2-MID-SagarPratapSingh-1010736.docx
@@ -102,7 +102,7 @@
           <w:rFonts w:ascii="Inconsolata" w:hAnsi="Inconsolata"/>
           <w:sz w:val="26"/>
         </w:rPr>
-        <w:t>This project investigates whether a fine-tuned, locally deployable language model can provide reliable compliance guidance for Singapore’s Cybersecurity Code of Practice (CCoP 2.0) — the regulatory standard governing Critical Information Infrastructure (CII). Term 1 established a 21-benchmark evaluation framework and baselined the untuned Primus-Reasoning model at 48.96%, revealing strong reasoning capability (61.6%) but severe factual grounding deficiencies (31.6%) including hallucination of regulatory facts. These findings prompted a strategic pivot for Term 2: rather than proceeding directly to fine-tuning, a Retrieval-Augmented Generation (RAG) pipeline was built first to ground the model in authoritative CCoP clause text. Term 2 work to date has delivered the complete RAG infrastructure (Qdrant hybrid search, clause-aware chunking, cross-encoder reranking, diagram captioning), an upgraded evaluation engine with dual-layer scoring (LLM-as-Judge benchmarks + RAGAs quality metrics), and a CLI supporting query, single-benchmark, and full-batch evaluation modes. Early query-level results confirm that RAG-augmented responses cite specific CCoP clauses with structured answers, while the unaugmented model continues to hallucinate from unrelated frameworks. The full batch evaluation across all 21 benchmarks is currently in progress; the resulting RAG-vs-baseline delta will determine which compliance domains still require fine-tuning.</w:t>
+        <w:t>Term 1 baselined the untuned Primus-Reasoning model at 48.96% across 21 benchmarks — strong reasoning (61.6%) but severe factual grounding gaps (31.6%) with frequent hallucination of regulatory facts. Term 2's objective is to close this grounding gap through retrieval-augmented generation before proceeding to fine-tuning. A complete RAG pipeline was built — Qdrant hybrid search, clause-aware chunking of 8 CCoP documents, cross-encoder reranking, and diagram captioning — grounding the model in authoritative clause text. The evaluation engine was upgraded with dual-layer scoring (LLM-as-Judge + RAGAs metrics) and a CLI supporting three evaluation granularities. Early results show RAG-augmented responses citing specific CCoP clauses, while the unaugmented model substitutes from unrelated frameworks. Full batch evaluation is in progress; the RAG-vs-baseline delta will determine which domains require fine-tuning.</w:t>
       </w:r>
     </w:p>
     <w:p>
@@ -882,34 +882,51 @@
       <w:r>
         <w:rPr>
           <w:rFonts w:ascii="Inconsolata" w:hAnsi="Inconsolata"/>
+          <w:b/>
+          <w:color w:val="365F91"/>
           <w:sz w:val="48"/>
         </w:rPr>
-        <w:t>4. Evaluation Infrastructure &amp; Benchmark Framework</w:t>
+        <w:t>4. Evaluation Framework &amp; Benchmark Scoring</w:t>
       </w:r>
     </w:p>
     <w:p>
+      <w:pPr/>
       <w:r>
         <w:rPr>
           <w:rFonts w:ascii="Inconsolata" w:hAnsi="Inconsolata"/>
           <w:sz w:val="26"/>
         </w:rPr>
-        <w:t>During Term 2 implementation, several limitations of the existing evaluation methodology were identified. The Term 1 evaluation relied on semantic similarity as a proxy metric for Tier 2 benchmarks (B8, B9, B11, B15, B17–B19) — comparing model responses against expected answers using embedding-based cosine similarity. While this approach was computationally efficient, it proved inadequate for compliance reasoning benchmarks: two responses can be semantically similar (discussing the same topic) while being substantively different in audit quality (one correctly prioritises risks, the other does not). Additionally, 4 benchmarks (B7, B10, B14, B16) had no scoring implementation at all.</w:t>
+        <w:t>The evaluation infrastructure uses two independent scoring mechanisms — RAGAs for automated quality metrics across three brackets (Retrieval Quality, Model-RAG Grounding, and Model Response Quality), and LLM-as-Judge (Claude Sonnet) for reasoning depth and hallucination detection across 16 benchmarks.</w:t>
       </w:r>
     </w:p>
     <w:p>
+      <w:pPr>
+        <w:pStyle w:val="Heading2"/>
+      </w:pPr>
+      <w:r>
+        <w:rPr>
+          <w:rFonts w:ascii="Inconsolata" w:hAnsi="Inconsolata"/>
+          <w:b/>
+          <w:color w:val="4F81BD"/>
+          <w:sz w:val="36"/>
+        </w:rPr>
+        <w:t>4.1 Quality Metrics</w:t>
+      </w:r>
+    </w:p>
+    <w:p>
+      <w:pPr/>
       <w:r>
         <w:rPr>
           <w:rFonts w:ascii="Inconsolata" w:hAnsi="Inconsolata"/>
           <w:sz w:val="26"/>
         </w:rPr>
-        <w:t>To address these limitations, the evaluation infrastructure was redesigned as a dual-layer architecture:</w:t>
+        <w:t>RAGAs evaluates response and retrieval quality across three quality brackets:</w:t>
       </w:r>
     </w:p>
     <w:tbl>
       <w:tblPr>
         <w:tblStyle w:val="TableGrid"/>
         <w:tblW w:type="auto" w:w="0"/>
-        <w:jc w:val="left"/>
         <w:tblLook w:firstColumn="1" w:firstRow="1" w:lastColumn="0" w:lastRow="0" w:noHBand="0" w:noVBand="1" w:val="04A0"/>
       </w:tblPr>
       <w:tblGrid>
@@ -922,7 +939,6 @@
         <w:tc>
           <w:tcPr>
             <w:tcW w:type="dxa" w:w="3240"/>
-            <w:shd w:fill="D9E2F3" w:val="clear"/>
           </w:tcPr>
           <w:p>
             <w:r/>
@@ -932,591 +948,13 @@
                 <w:b/>
                 <w:sz w:val="20"/>
               </w:rPr>
-              <w:t>Layer</w:t>
+              <w:t>Quality Bracket</w:t>
             </w:r>
           </w:p>
         </w:tc>
         <w:tc>
           <w:tcPr>
             <w:tcW w:type="dxa" w:w="3240"/>
-            <w:shd w:fill="D9E2F3" w:val="clear"/>
-          </w:tcPr>
-          <w:p>
-            <w:r/>
-            <w:r>
-              <w:rPr>
-                <w:rFonts w:ascii="Inconsolata" w:hAnsi="Inconsolata"/>
-                <w:b/>
-                <w:sz w:val="20"/>
-              </w:rPr>
-              <w:t>Purpose</w:t>
-            </w:r>
-          </w:p>
-        </w:tc>
-        <w:tc>
-          <w:tcPr>
-            <w:tcW w:type="dxa" w:w="3240"/>
-            <w:shd w:fill="D9E2F3" w:val="clear"/>
-          </w:tcPr>
-          <w:p>
-            <w:r/>
-            <w:r>
-              <w:rPr>
-                <w:rFonts w:ascii="Inconsolata" w:hAnsi="Inconsolata"/>
-                <w:b/>
-                <w:sz w:val="20"/>
-              </w:rPr>
-              <w:t>Scope</w:t>
-            </w:r>
-          </w:p>
-        </w:tc>
-        <w:tc>
-          <w:tcPr>
-            <w:tcW w:type="dxa" w:w="3240"/>
-            <w:shd w:fill="D9E2F3" w:val="clear"/>
-          </w:tcPr>
-          <w:p>
-            <w:r/>
-            <w:r>
-              <w:rPr>
-                <w:rFonts w:ascii="Inconsolata" w:hAnsi="Inconsolata"/>
-                <w:b/>
-                <w:sz w:val="20"/>
-              </w:rPr>
-              <w:t>Method</w:t>
-            </w:r>
-          </w:p>
-        </w:tc>
-      </w:tr>
-      <w:tr>
-        <w:tc>
-          <w:tcPr>
-            <w:tcW w:type="dxa" w:w="3240"/>
-          </w:tcPr>
-          <w:p>
-            <w:r/>
-            <w:r>
-              <w:rPr>
-                <w:rFonts w:ascii="Inconsolata" w:hAnsi="Inconsolata"/>
-                <w:sz w:val="20"/>
-              </w:rPr>
-            </w:r>
-            <w:r>
-              <w:rPr>
-                <w:rFonts w:ascii="Inconsolata" w:hAnsi="Inconsolata"/>
-                <w:b/>
-                <w:sz w:val="20"/>
-              </w:rPr>
-              <w:t>Layer 1: Benchmark Scoring</w:t>
-            </w:r>
-            <w:r>
-              <w:rPr>
-                <w:rFonts w:ascii="Inconsolata" w:hAnsi="Inconsolata"/>
-                <w:sz w:val="20"/>
-              </w:rPr>
-            </w:r>
-          </w:p>
-        </w:tc>
-        <w:tc>
-          <w:tcPr>
-            <w:tcW w:type="dxa" w:w="3240"/>
-          </w:tcPr>
-          <w:p>
-            <w:r/>
-            <w:r>
-              <w:rPr>
-                <w:rFonts w:ascii="Inconsolata" w:hAnsi="Inconsolata"/>
-                <w:sz w:val="20"/>
-              </w:rPr>
-              <w:t>Domain-specific compliance quality</w:t>
-            </w:r>
-          </w:p>
-        </w:tc>
-        <w:tc>
-          <w:tcPr>
-            <w:tcW w:type="dxa" w:w="3240"/>
-          </w:tcPr>
-          <w:p>
-            <w:r/>
-            <w:r>
-              <w:rPr>
-                <w:rFonts w:ascii="Inconsolata" w:hAnsi="Inconsolata"/>
-                <w:sz w:val="20"/>
-              </w:rPr>
-              <w:t>21 benchmarks (B1–B21)</w:t>
-            </w:r>
-          </w:p>
-        </w:tc>
-        <w:tc>
-          <w:tcPr>
-            <w:tcW w:type="dxa" w:w="3240"/>
-          </w:tcPr>
-          <w:p>
-            <w:r/>
-            <w:r>
-              <w:rPr>
-                <w:rFonts w:ascii="Inconsolata" w:hAnsi="Inconsolata"/>
-                <w:sz w:val="20"/>
-              </w:rPr>
-              <w:t>6 rule-based (B1, B2, B4, B5, B6, B21) + 15 LLM-as-Judge (B3, B7–B20)</w:t>
-            </w:r>
-          </w:p>
-        </w:tc>
-      </w:tr>
-      <w:tr>
-        <w:tc>
-          <w:tcPr>
-            <w:tcW w:type="dxa" w:w="3240"/>
-          </w:tcPr>
-          <w:p>
-            <w:r/>
-            <w:r>
-              <w:rPr>
-                <w:rFonts w:ascii="Inconsolata" w:hAnsi="Inconsolata"/>
-                <w:sz w:val="20"/>
-              </w:rPr>
-            </w:r>
-            <w:r>
-              <w:rPr>
-                <w:rFonts w:ascii="Inconsolata" w:hAnsi="Inconsolata"/>
-                <w:b/>
-                <w:sz w:val="20"/>
-              </w:rPr>
-              <w:t>Layer 2: RAGAs Metrics</w:t>
-            </w:r>
-            <w:r>
-              <w:rPr>
-                <w:rFonts w:ascii="Inconsolata" w:hAnsi="Inconsolata"/>
-                <w:sz w:val="20"/>
-              </w:rPr>
-            </w:r>
-          </w:p>
-        </w:tc>
-        <w:tc>
-          <w:tcPr>
-            <w:tcW w:type="dxa" w:w="3240"/>
-          </w:tcPr>
-          <w:p>
-            <w:r/>
-            <w:r>
-              <w:rPr>
-                <w:rFonts w:ascii="Inconsolata" w:hAnsi="Inconsolata"/>
-                <w:sz w:val="20"/>
-              </w:rPr>
-              <w:t>Generic response and retrieval quality</w:t>
-            </w:r>
-          </w:p>
-        </w:tc>
-        <w:tc>
-          <w:tcPr>
-            <w:tcW w:type="dxa" w:w="3240"/>
-          </w:tcPr>
-          <w:p>
-            <w:r/>
-            <w:r>
-              <w:rPr>
-                <w:rFonts w:ascii="Inconsolata" w:hAnsi="Inconsolata"/>
-                <w:sz w:val="20"/>
-              </w:rPr>
-              <w:t>All responses (base + RAG-augmented)</w:t>
-            </w:r>
-          </w:p>
-        </w:tc>
-        <w:tc>
-          <w:tcPr>
-            <w:tcW w:type="dxa" w:w="3240"/>
-          </w:tcPr>
-          <w:p>
-            <w:r/>
-            <w:r>
-              <w:rPr>
-                <w:rFonts w:ascii="Inconsolata" w:hAnsi="Inconsolata"/>
-                <w:sz w:val="20"/>
-              </w:rPr>
-              <w:t>5 automated metrics via RAGAs framework</w:t>
-            </w:r>
-          </w:p>
-        </w:tc>
-      </w:tr>
-    </w:tbl>
-    <w:p/>
-    <w:p>
-      <w:r>
-        <w:rPr>
-          <w:rFonts w:ascii="Inconsolata" w:hAnsi="Inconsolata"/>
-          <w:sz w:val="26"/>
-        </w:rPr>
-      </w:r>
-      <w:r>
-        <w:rPr>
-          <w:rFonts w:ascii="Inconsolata" w:hAnsi="Inconsolata"/>
-          <w:b/>
-          <w:sz w:val="26"/>
-        </w:rPr>
-        <w:t>Layer 1 determines pass/fail and the overall weighted score.</w:t>
-      </w:r>
-      <w:r>
-        <w:rPr>
-          <w:rFonts w:ascii="Inconsolata" w:hAnsi="Inconsolata"/>
-          <w:sz w:val="26"/>
-        </w:rPr>
-        <w:t xml:space="preserve"> Layer 2 operates independently as a diagnostic layer — it assesses response and retrieval quality without influencing benchmark pass/fail determination. This separation enables richer analysis: a response can score high on RAGAs (well-grounded in retrieved context) but low on benchmarks (poor compliance reasoning), or vice versa.</w:t>
-      </w:r>
-    </w:p>
-    <w:p>
-      <w:pPr>
-        <w:pStyle w:val="Heading2"/>
-      </w:pPr>
-      <w:r>
-        <w:rPr>
-          <w:rFonts w:ascii="Inconsolata" w:hAnsi="Inconsolata"/>
-          <w:sz w:val="36"/>
-        </w:rPr>
-        <w:t>4.1 Layer 1: LLM-as-Judge Benchmark Scoring</w:t>
-      </w:r>
-    </w:p>
-    <w:p>
-      <w:r>
-        <w:rPr>
-          <w:rFonts w:ascii="Inconsolata" w:hAnsi="Inconsolata"/>
-          <w:sz w:val="26"/>
-        </w:rPr>
-        <w:t>Each of the 15 LLM-judged benchmarks has a dedicated rubric template with benchmark-specific evaluation dimensions. Each anchor includes CCoP-specific examples to reduce judge subjectivity. For instance, the B8 (Gap Prioritisation) rubric evaluates the model's ability to prioritise compliance gaps using risk-based criteria. Given the following test question:</w:t>
-      </w:r>
-    </w:p>
-    <w:p>
-      <w:pPr>
-        <w:ind w:left="720"/>
-      </w:pPr>
-      <w:r>
-        <w:rPr>
-          <w:rFonts w:ascii="Inconsolata" w:hAnsi="Inconsolata"/>
-          <w:i/>
-          <w:sz w:val="26"/>
-        </w:rPr>
-        <w:t>"A CIIO's audit identified three control gaps: (1) MFA not implemented for remote access to CII (Clause 5.1.5), (2) Security logs only retained for 6 months instead of 1 year (Clause 6.1.3), (3) Cybersecurity awareness training completed by 85% of personnel, 15% overdue (Clause 9.1.2). Which gap should be addressed first and why?"</w:t>
-      </w:r>
-    </w:p>
-    <w:p>
-      <w:r>
-        <w:rPr>
-          <w:rFonts w:ascii="Inconsolata" w:hAnsi="Inconsolata"/>
-          <w:sz w:val="26"/>
-        </w:rPr>
-        <w:t>The judge evaluates the model's response against the following anchored 0–3 scale:</w:t>
-      </w:r>
-    </w:p>
-    <w:tbl>
-      <w:tblPr>
-        <w:tblStyle w:val="TableGrid"/>
-        <w:tblW w:type="auto" w:w="0"/>
-        <w:jc w:val="left"/>
-        <w:tblLook w:firstColumn="1" w:firstRow="1" w:lastColumn="0" w:lastRow="0" w:noHBand="0" w:noVBand="1" w:val="04A0"/>
-      </w:tblPr>
-      <w:tblGrid>
-        <w:gridCol w:w="4320"/>
-        <w:gridCol w:w="4320"/>
-        <w:gridCol w:w="4320"/>
-      </w:tblGrid>
-      <w:tr>
-        <w:tc>
-          <w:tcPr>
-            <w:tcW w:type="dxa" w:w="4320"/>
-            <w:shd w:fill="D9E2F3" w:val="clear"/>
-          </w:tcPr>
-          <w:p>
-            <w:r/>
-            <w:r>
-              <w:rPr>
-                <w:rFonts w:ascii="Inconsolata" w:hAnsi="Inconsolata"/>
-                <w:b/>
-                <w:sz w:val="20"/>
-              </w:rPr>
-              <w:t>Score</w:t>
-            </w:r>
-          </w:p>
-        </w:tc>
-        <w:tc>
-          <w:tcPr>
-            <w:tcW w:type="dxa" w:w="4320"/>
-            <w:shd w:fill="D9E2F3" w:val="clear"/>
-          </w:tcPr>
-          <w:p>
-            <w:r/>
-            <w:r>
-              <w:rPr>
-                <w:rFonts w:ascii="Inconsolata" w:hAnsi="Inconsolata"/>
-                <w:b/>
-                <w:sz w:val="20"/>
-              </w:rPr>
-              <w:t>Anchor</w:t>
-            </w:r>
-          </w:p>
-        </w:tc>
-        <w:tc>
-          <w:tcPr>
-            <w:tcW w:type="dxa" w:w="4320"/>
-            <w:shd w:fill="D9E2F3" w:val="clear"/>
-          </w:tcPr>
-          <w:p>
-            <w:r/>
-            <w:r>
-              <w:rPr>
-                <w:rFonts w:ascii="Inconsolata" w:hAnsi="Inconsolata"/>
-                <w:b/>
-                <w:sz w:val="20"/>
-              </w:rPr>
-              <w:t>B8 Example</w:t>
-            </w:r>
-          </w:p>
-        </w:tc>
-      </w:tr>
-      <w:tr>
-        <w:tc>
-          <w:tcPr>
-            <w:tcW w:type="dxa" w:w="4320"/>
-          </w:tcPr>
-          <w:p>
-            <w:r/>
-            <w:r>
-              <w:rPr>
-                <w:rFonts w:ascii="Inconsolata" w:hAnsi="Inconsolata"/>
-                <w:sz w:val="20"/>
-              </w:rPr>
-              <w:t>0</w:t>
-            </w:r>
-          </w:p>
-        </w:tc>
-        <w:tc>
-          <w:tcPr>
-            <w:tcW w:type="dxa" w:w="4320"/>
-          </w:tcPr>
-          <w:p>
-            <w:r/>
-            <w:r>
-              <w:rPr>
-                <w:rFonts w:ascii="Inconsolata" w:hAnsi="Inconsolata"/>
-                <w:sz w:val="20"/>
-              </w:rPr>
-              <w:t>Incorrect — fundamentally wrong or missing</w:t>
-            </w:r>
-          </w:p>
-        </w:tc>
-        <w:tc>
-          <w:tcPr>
-            <w:tcW w:type="dxa" w:w="4320"/>
-          </w:tcPr>
-          <w:p>
-            <w:r/>
-            <w:r>
-              <w:rPr>
-                <w:rFonts w:ascii="Inconsolata" w:hAnsi="Inconsolata"/>
-                <w:sz w:val="20"/>
-              </w:rPr>
-              <w:t>Lists gaps alphabetically; prioritises cosmetic issue over critical MFA gap</w:t>
-            </w:r>
-          </w:p>
-        </w:tc>
-      </w:tr>
-      <w:tr>
-        <w:tc>
-          <w:tcPr>
-            <w:tcW w:type="dxa" w:w="4320"/>
-          </w:tcPr>
-          <w:p>
-            <w:r/>
-            <w:r>
-              <w:rPr>
-                <w:rFonts w:ascii="Inconsolata" w:hAnsi="Inconsolata"/>
-                <w:sz w:val="20"/>
-              </w:rPr>
-              <w:t>1</w:t>
-            </w:r>
-          </w:p>
-        </w:tc>
-        <w:tc>
-          <w:tcPr>
-            <w:tcW w:type="dxa" w:w="4320"/>
-          </w:tcPr>
-          <w:p>
-            <w:r/>
-            <w:r>
-              <w:rPr>
-                <w:rFonts w:ascii="Inconsolata" w:hAnsi="Inconsolata"/>
-                <w:sz w:val="20"/>
-              </w:rPr>
-              <w:t>Partial — attempted but incomplete or inconsistent</w:t>
-            </w:r>
-          </w:p>
-        </w:tc>
-        <w:tc>
-          <w:tcPr>
-            <w:tcW w:type="dxa" w:w="4320"/>
-          </w:tcPr>
-          <w:p>
-            <w:r/>
-            <w:r>
-              <w:rPr>
-                <w:rFonts w:ascii="Inconsolata" w:hAnsi="Inconsolata"/>
-                <w:sz w:val="20"/>
-              </w:rPr>
-              <w:t>"Fix MFA first because it's important" without risk-based reasoning</w:t>
-            </w:r>
-          </w:p>
-        </w:tc>
-      </w:tr>
-      <w:tr>
-        <w:tc>
-          <w:tcPr>
-            <w:tcW w:type="dxa" w:w="4320"/>
-          </w:tcPr>
-          <w:p>
-            <w:r/>
-            <w:r>
-              <w:rPr>
-                <w:rFonts w:ascii="Inconsolata" w:hAnsi="Inconsolata"/>
-                <w:sz w:val="20"/>
-              </w:rPr>
-              <w:t>2</w:t>
-            </w:r>
-          </w:p>
-        </w:tc>
-        <w:tc>
-          <w:tcPr>
-            <w:tcW w:type="dxa" w:w="4320"/>
-          </w:tcPr>
-          <w:p>
-            <w:r/>
-            <w:r>
-              <w:rPr>
-                <w:rFonts w:ascii="Inconsolata" w:hAnsi="Inconsolata"/>
-                <w:sz w:val="20"/>
-              </w:rPr>
-              <w:t>Complete — meets the requirement with clear reasoning</w:t>
-            </w:r>
-          </w:p>
-        </w:tc>
-        <w:tc>
-          <w:tcPr>
-            <w:tcW w:type="dxa" w:w="4320"/>
-          </w:tcPr>
-          <w:p>
-            <w:r/>
-            <w:r>
-              <w:rPr>
-                <w:rFonts w:ascii="Inconsolata" w:hAnsi="Inconsolata"/>
-                <w:sz w:val="20"/>
-              </w:rPr>
-              <w:t>"Priority 1: MFA (critical — remote access is primary attack vector, direct essential service impact). Priority 2: Segmentation (high — limits blast radius)"</w:t>
-            </w:r>
-          </w:p>
-        </w:tc>
-      </w:tr>
-      <w:tr>
-        <w:tc>
-          <w:tcPr>
-            <w:tcW w:type="dxa" w:w="4320"/>
-          </w:tcPr>
-          <w:p>
-            <w:r/>
-            <w:r>
-              <w:rPr>
-                <w:rFonts w:ascii="Inconsolata" w:hAnsi="Inconsolata"/>
-                <w:sz w:val="20"/>
-              </w:rPr>
-              <w:t>3</w:t>
-            </w:r>
-          </w:p>
-        </w:tc>
-        <w:tc>
-          <w:tcPr>
-            <w:tcW w:type="dxa" w:w="4320"/>
-          </w:tcPr>
-          <w:p>
-            <w:r/>
-            <w:r>
-              <w:rPr>
-                <w:rFonts w:ascii="Inconsolata" w:hAnsi="Inconsolata"/>
-                <w:sz w:val="20"/>
-              </w:rPr>
-              <w:t>Exceeds — goes beyond with additional practical insight</w:t>
-            </w:r>
-          </w:p>
-        </w:tc>
-        <w:tc>
-          <w:tcPr>
-            <w:tcW w:type="dxa" w:w="4320"/>
-          </w:tcPr>
-          <w:p>
-            <w:r/>
-            <w:r>
-              <w:rPr>
-                <w:rFonts w:ascii="Inconsolata" w:hAnsi="Inconsolata"/>
-                <w:sz w:val="20"/>
-              </w:rPr>
-              <w:t>Risk-based prioritisation plus implementation sequencing: "Quick win: MFA can be deployed in 2 weeks with existing IAM. Strategic: segmentation requires network redesign — start architecture review now"</w:t>
-            </w:r>
-          </w:p>
-        </w:tc>
-      </w:tr>
-    </w:tbl>
-    <w:p/>
-    <w:p>
-      <w:r>
-        <w:rPr>
-          <w:rFonts w:ascii="Inconsolata" w:hAnsi="Inconsolata"/>
-          <w:sz w:val="26"/>
-        </w:rPr>
-        <w:t>The judge LLM (Claude Sonnet) receives the question, model response, expected response, and key facts alongside the rubric, then produces dimension scores with justification. If the judge fails to produce a valid response, the benchmark is flagged with a skip-and-flag error rather than assigned a fallback score — missing data is preferred over wrong data.</w:t>
-      </w:r>
-    </w:p>
-    <w:p>
-      <w:r>
-        <w:rPr>
-          <w:rFonts w:ascii="Inconsolata" w:hAnsi="Inconsolata"/>
-          <w:sz w:val="26"/>
-        </w:rPr>
-        <w:t>The SemanticSimilarityService was removed entirely from the codebase as all its responsibilities are now handled by the LLMJudgeService.</w:t>
-      </w:r>
-    </w:p>
-    <w:p>
-      <w:pPr>
-        <w:pStyle w:val="Heading2"/>
-      </w:pPr>
-      <w:r>
-        <w:rPr>
-          <w:rFonts w:ascii="Inconsolata" w:hAnsi="Inconsolata"/>
-          <w:sz w:val="36"/>
-        </w:rPr>
-        <w:t>4.2 Layer 2: RAGAs Quality Metrics</w:t>
-      </w:r>
-    </w:p>
-    <w:p>
-      <w:r>
-        <w:rPr>
-          <w:rFonts w:ascii="Inconsolata" w:hAnsi="Inconsolata"/>
-          <w:sz w:val="26"/>
-        </w:rPr>
-        <w:t>The RAGAs layer evaluates response and retrieval quality using 5 automated metrics:</w:t>
-      </w:r>
-    </w:p>
-    <w:tbl>
-      <w:tblPr>
-        <w:tblStyle w:val="TableGrid"/>
-        <w:tblW w:type="auto" w:w="0"/>
-        <w:jc w:val="left"/>
-        <w:tblLook w:firstColumn="1" w:firstRow="1" w:lastColumn="0" w:lastRow="0" w:noHBand="0" w:noVBand="1" w:val="04A0"/>
-      </w:tblPr>
-      <w:tblGrid>
-        <w:gridCol w:w="4320"/>
-        <w:gridCol w:w="4320"/>
-        <w:gridCol w:w="4320"/>
-      </w:tblGrid>
-      <w:tr>
-        <w:tc>
-          <w:tcPr>
-            <w:tcW w:type="dxa" w:w="4320"/>
-            <w:shd w:fill="D9E2F3" w:val="clear"/>
           </w:tcPr>
           <w:p>
             <w:r/>
@@ -1532,8 +970,7 @@
         </w:tc>
         <w:tc>
           <w:tcPr>
-            <w:tcW w:type="dxa" w:w="4320"/>
-            <w:shd w:fill="D9E2F3" w:val="clear"/>
+            <w:tcW w:type="dxa" w:w="3240"/>
           </w:tcPr>
           <w:p>
             <w:r/>
@@ -1549,8 +986,7 @@
         </w:tc>
         <w:tc>
           <w:tcPr>
-            <w:tcW w:type="dxa" w:w="4320"/>
-            <w:shd w:fill="D9E2F3" w:val="clear"/>
+            <w:tcW w:type="dxa" w:w="3240"/>
           </w:tcPr>
           <w:p>
             <w:r/>
@@ -1568,7 +1004,7 @@
       <w:tr>
         <w:tc>
           <w:tcPr>
-            <w:tcW w:type="dxa" w:w="4320"/>
+            <w:tcW w:type="dxa" w:w="3240"/>
           </w:tcPr>
           <w:p>
             <w:r/>
@@ -1577,7 +1013,426 @@
                 <w:rFonts w:ascii="Inconsolata" w:hAnsi="Inconsolata"/>
                 <w:sz w:val="20"/>
               </w:rPr>
-              <w:t>answer_correctness</w:t>
+              <w:t>Retrieval Quality</w:t>
+            </w:r>
+          </w:p>
+        </w:tc>
+        <w:tc>
+          <w:tcPr>
+            <w:tcW w:type="dxa" w:w="3240"/>
+          </w:tcPr>
+          <w:p>
+            <w:r/>
+            <w:r>
+              <w:rPr>
+                <w:rFonts w:ascii="Inconsolata" w:hAnsi="Inconsolata"/>
+                <w:sz w:val="20"/>
+              </w:rPr>
+              <w:t>context_precision</w:t>
+            </w:r>
+          </w:p>
+        </w:tc>
+        <w:tc>
+          <w:tcPr>
+            <w:tcW w:type="dxa" w:w="3240"/>
+          </w:tcPr>
+          <w:p>
+            <w:r/>
+            <w:r>
+              <w:rPr>
+                <w:rFonts w:ascii="Inconsolata" w:hAnsi="Inconsolata"/>
+                <w:sz w:val="20"/>
+              </w:rPr>
+              <w:t>RAG-augmented only</w:t>
+            </w:r>
+          </w:p>
+        </w:tc>
+        <w:tc>
+          <w:tcPr>
+            <w:tcW w:type="dxa" w:w="3240"/>
+          </w:tcPr>
+          <w:p>
+            <w:r/>
+            <w:r>
+              <w:rPr>
+                <w:rFonts w:ascii="Inconsolata" w:hAnsi="Inconsolata"/>
+                <w:sz w:val="20"/>
+              </w:rPr>
+              <w:t>Whether retrieved chunks are relevant to the question</w:t>
+            </w:r>
+          </w:p>
+        </w:tc>
+      </w:tr>
+      <w:tr>
+        <w:tc>
+          <w:tcPr>
+            <w:tcW w:type="dxa" w:w="3240"/>
+          </w:tcPr>
+          <w:p>
+            <w:r/>
+            <w:r>
+              <w:rPr>
+                <w:rFonts w:ascii="Inconsolata" w:hAnsi="Inconsolata"/>
+                <w:sz w:val="20"/>
+              </w:rPr>
+              <w:t>Retrieval Quality</w:t>
+            </w:r>
+          </w:p>
+        </w:tc>
+        <w:tc>
+          <w:tcPr>
+            <w:tcW w:type="dxa" w:w="3240"/>
+          </w:tcPr>
+          <w:p>
+            <w:r/>
+            <w:r>
+              <w:rPr>
+                <w:rFonts w:ascii="Inconsolata" w:hAnsi="Inconsolata"/>
+                <w:sz w:val="20"/>
+              </w:rPr>
+              <w:t>context_recall</w:t>
+            </w:r>
+          </w:p>
+        </w:tc>
+        <w:tc>
+          <w:tcPr>
+            <w:tcW w:type="dxa" w:w="3240"/>
+          </w:tcPr>
+          <w:p>
+            <w:r/>
+            <w:r>
+              <w:rPr>
+                <w:rFonts w:ascii="Inconsolata" w:hAnsi="Inconsolata"/>
+                <w:sz w:val="20"/>
+              </w:rPr>
+              <w:t>RAG-augmented only</w:t>
+            </w:r>
+          </w:p>
+        </w:tc>
+        <w:tc>
+          <w:tcPr>
+            <w:tcW w:type="dxa" w:w="3240"/>
+          </w:tcPr>
+          <w:p>
+            <w:r/>
+            <w:r>
+              <w:rPr>
+                <w:rFonts w:ascii="Inconsolata" w:hAnsi="Inconsolata"/>
+                <w:sz w:val="20"/>
+              </w:rPr>
+              <w:t>Whether retrieved chunks contain the information needed to answer</w:t>
+            </w:r>
+          </w:p>
+        </w:tc>
+      </w:tr>
+      <w:tr>
+        <w:tc>
+          <w:tcPr>
+            <w:tcW w:type="dxa" w:w="3240"/>
+          </w:tcPr>
+          <w:p>
+            <w:r/>
+            <w:r>
+              <w:rPr>
+                <w:rFonts w:ascii="Inconsolata" w:hAnsi="Inconsolata"/>
+                <w:sz w:val="20"/>
+              </w:rPr>
+              <w:t>Model-RAG Grounding</w:t>
+            </w:r>
+          </w:p>
+        </w:tc>
+        <w:tc>
+          <w:tcPr>
+            <w:tcW w:type="dxa" w:w="3240"/>
+          </w:tcPr>
+          <w:p>
+            <w:r/>
+            <w:r>
+              <w:rPr>
+                <w:rFonts w:ascii="Inconsolata" w:hAnsi="Inconsolata"/>
+                <w:sz w:val="20"/>
+              </w:rPr>
+              <w:t>context_faithfulness</w:t>
+            </w:r>
+          </w:p>
+        </w:tc>
+        <w:tc>
+          <w:tcPr>
+            <w:tcW w:type="dxa" w:w="3240"/>
+          </w:tcPr>
+          <w:p>
+            <w:r/>
+            <w:r>
+              <w:rPr>
+                <w:rFonts w:ascii="Inconsolata" w:hAnsi="Inconsolata"/>
+                <w:sz w:val="20"/>
+              </w:rPr>
+              <w:t>RAG-augmented only</w:t>
+            </w:r>
+          </w:p>
+        </w:tc>
+        <w:tc>
+          <w:tcPr>
+            <w:tcW w:type="dxa" w:w="3240"/>
+          </w:tcPr>
+          <w:p>
+            <w:r/>
+            <w:r>
+              <w:rPr>
+                <w:rFonts w:ascii="Inconsolata" w:hAnsi="Inconsolata"/>
+                <w:sz w:val="20"/>
+              </w:rPr>
+              <w:t>Whether the response is supported by retrieved context</w:t>
+            </w:r>
+          </w:p>
+        </w:tc>
+      </w:tr>
+      <w:tr>
+        <w:tc>
+          <w:tcPr>
+            <w:tcW w:type="dxa" w:w="3240"/>
+          </w:tcPr>
+          <w:p>
+            <w:r/>
+            <w:r>
+              <w:rPr>
+                <w:rFonts w:ascii="Inconsolata" w:hAnsi="Inconsolata"/>
+                <w:sz w:val="20"/>
+              </w:rPr>
+              <w:t>Model Response Quality</w:t>
+            </w:r>
+          </w:p>
+        </w:tc>
+        <w:tc>
+          <w:tcPr>
+            <w:tcW w:type="dxa" w:w="3240"/>
+          </w:tcPr>
+          <w:p>
+            <w:r/>
+            <w:r>
+              <w:rPr>
+                <w:rFonts w:ascii="Inconsolata" w:hAnsi="Inconsolata"/>
+                <w:sz w:val="20"/>
+              </w:rPr>
+              <w:t>factual_recall</w:t>
+            </w:r>
+          </w:p>
+        </w:tc>
+        <w:tc>
+          <w:tcPr>
+            <w:tcW w:type="dxa" w:w="3240"/>
+          </w:tcPr>
+          <w:p>
+            <w:r/>
+            <w:r>
+              <w:rPr>
+                <w:rFonts w:ascii="Inconsolata" w:hAnsi="Inconsolata"/>
+                <w:sz w:val="20"/>
+              </w:rPr>
+              <w:t>RAG-augmented and LLM-only</w:t>
+            </w:r>
+          </w:p>
+        </w:tc>
+        <w:tc>
+          <w:tcPr>
+            <w:tcW w:type="dxa" w:w="3240"/>
+          </w:tcPr>
+          <w:p>
+            <w:r/>
+            <w:r>
+              <w:rPr>
+                <w:rFonts w:ascii="Inconsolata" w:hAnsi="Inconsolata"/>
+                <w:sz w:val="20"/>
+              </w:rPr>
+              <w:t>Factual coverage of the response against ground truth</w:t>
+            </w:r>
+          </w:p>
+        </w:tc>
+      </w:tr>
+      <w:tr>
+        <w:tc>
+          <w:tcPr>
+            <w:tcW w:type="dxa" w:w="3240"/>
+          </w:tcPr>
+          <w:p>
+            <w:r/>
+            <w:r>
+              <w:rPr>
+                <w:rFonts w:ascii="Inconsolata" w:hAnsi="Inconsolata"/>
+                <w:sz w:val="20"/>
+              </w:rPr>
+              <w:t>Model Response Quality</w:t>
+            </w:r>
+          </w:p>
+        </w:tc>
+        <w:tc>
+          <w:tcPr>
+            <w:tcW w:type="dxa" w:w="3240"/>
+          </w:tcPr>
+          <w:p>
+            <w:r/>
+            <w:r>
+              <w:rPr>
+                <w:rFonts w:ascii="Inconsolata" w:hAnsi="Inconsolata"/>
+                <w:sz w:val="20"/>
+              </w:rPr>
+              <w:t>answer_relevancy</w:t>
+            </w:r>
+          </w:p>
+        </w:tc>
+        <w:tc>
+          <w:tcPr>
+            <w:tcW w:type="dxa" w:w="3240"/>
+          </w:tcPr>
+          <w:p>
+            <w:r/>
+            <w:r>
+              <w:rPr>
+                <w:rFonts w:ascii="Inconsolata" w:hAnsi="Inconsolata"/>
+                <w:sz w:val="20"/>
+              </w:rPr>
+              <w:t>RAG-augmented and LLM-only</w:t>
+            </w:r>
+          </w:p>
+        </w:tc>
+        <w:tc>
+          <w:tcPr>
+            <w:tcW w:type="dxa" w:w="3240"/>
+          </w:tcPr>
+          <w:p>
+            <w:r/>
+            <w:r>
+              <w:rPr>
+                <w:rFonts w:ascii="Inconsolata" w:hAnsi="Inconsolata"/>
+                <w:sz w:val="20"/>
+              </w:rPr>
+              <w:t>Whether the response addresses the question asked</w:t>
+            </w:r>
+          </w:p>
+        </w:tc>
+      </w:tr>
+      <w:tr>
+        <w:tc>
+          <w:tcPr>
+            <w:tcW w:type="dxa" w:w="3240"/>
+          </w:tcPr>
+          <w:p>
+            <w:r/>
+            <w:r>
+              <w:rPr>
+                <w:rFonts w:ascii="Inconsolata" w:hAnsi="Inconsolata"/>
+                <w:sz w:val="20"/>
+              </w:rPr>
+              <w:t>Model Response Quality</w:t>
+            </w:r>
+          </w:p>
+        </w:tc>
+        <w:tc>
+          <w:tcPr>
+            <w:tcW w:type="dxa" w:w="3240"/>
+          </w:tcPr>
+          <w:p>
+            <w:r/>
+            <w:r>
+              <w:rPr>
+                <w:rFonts w:ascii="Inconsolata" w:hAnsi="Inconsolata"/>
+                <w:sz w:val="20"/>
+              </w:rPr>
+              <w:t>semantic_similarity</w:t>
+            </w:r>
+          </w:p>
+        </w:tc>
+        <w:tc>
+          <w:tcPr>
+            <w:tcW w:type="dxa" w:w="3240"/>
+          </w:tcPr>
+          <w:p>
+            <w:r/>
+            <w:r>
+              <w:rPr>
+                <w:rFonts w:ascii="Inconsolata" w:hAnsi="Inconsolata"/>
+                <w:sz w:val="20"/>
+              </w:rPr>
+              <w:t>RAG-augmented and LLM-only</w:t>
+            </w:r>
+          </w:p>
+        </w:tc>
+        <w:tc>
+          <w:tcPr>
+            <w:tcW w:type="dxa" w:w="3240"/>
+          </w:tcPr>
+          <w:p>
+            <w:r/>
+            <w:r>
+              <w:rPr>
+                <w:rFonts w:ascii="Inconsolata" w:hAnsi="Inconsolata"/>
+                <w:sz w:val="20"/>
+              </w:rPr>
+              <w:t>Semantic alignment between response and expected answer</w:t>
+            </w:r>
+          </w:p>
+        </w:tc>
+      </w:tr>
+    </w:tbl>
+    <w:p>
+      <w:pPr/>
+      <w:r>
+        <w:rPr>
+          <w:rFonts w:ascii="Inconsolata" w:hAnsi="Inconsolata"/>
+          <w:sz w:val="26"/>
+        </w:rPr>
+        <w:t>The RAGAs composite score is a simple average of the three base metrics: (factual_recall + answer_relevancy + semantic_similarity) / 3.</w:t>
+      </w:r>
+    </w:p>
+    <w:p>
+      <w:pPr>
+        <w:pStyle w:val="Heading2"/>
+      </w:pPr>
+      <w:r>
+        <w:rPr>
+          <w:rFonts w:ascii="Inconsolata" w:hAnsi="Inconsolata"/>
+          <w:b/>
+          <w:color w:val="4F81BD"/>
+          <w:sz w:val="36"/>
+        </w:rPr>
+        <w:t>4.2 LLM-as-Judge Scoring</w:t>
+      </w:r>
+    </w:p>
+    <w:p>
+      <w:pPr/>
+      <w:r>
+        <w:rPr>
+          <w:rFonts w:ascii="Inconsolata" w:hAnsi="Inconsolata"/>
+          <w:sz w:val="26"/>
+        </w:rPr>
+        <w:t>The LLM judge (Claude Sonnet) evaluates each response in a single call across two dimensions:</w:t>
+      </w:r>
+    </w:p>
+    <w:tbl>
+      <w:tblPr>
+        <w:tblStyle w:val="TableGrid"/>
+        <w:tblW w:type="auto" w:w="0"/>
+        <w:tblLook w:firstColumn="1" w:firstRow="1" w:lastColumn="0" w:lastRow="0" w:noHBand="0" w:noVBand="1" w:val="04A0"/>
+      </w:tblPr>
+      <w:tblGrid>
+        <w:gridCol w:w="4320"/>
+        <w:gridCol w:w="4320"/>
+        <w:gridCol w:w="4320"/>
+      </w:tblGrid>
+      <w:tr>
+        <w:tc>
+          <w:tcPr>
+            <w:tcW w:type="dxa" w:w="4320"/>
+          </w:tcPr>
+          <w:p>
+            <w:r/>
+            <w:r>
+              <w:rPr>
+                <w:rFonts w:ascii="Inconsolata" w:hAnsi="Inconsolata"/>
+                <w:b/>
+                <w:sz w:val="20"/>
+              </w:rPr>
+              <w:t>Dimension</w:t>
             </w:r>
           </w:p>
         </w:tc>
@@ -1590,9 +1445,10 @@
             <w:r>
               <w:rPr>
                 <w:rFonts w:ascii="Inconsolata" w:hAnsi="Inconsolata"/>
+                <w:b/>
                 <w:sz w:val="20"/>
               </w:rPr>
-              <w:t>All responses</w:t>
+              <w:t>Scale</w:t>
             </w:r>
           </w:p>
         </w:tc>
@@ -1605,9 +1461,10 @@
             <w:r>
               <w:rPr>
                 <w:rFonts w:ascii="Inconsolata" w:hAnsi="Inconsolata"/>
+                <w:b/>
                 <w:sz w:val="20"/>
               </w:rPr>
-              <w:t>Factual accuracy of the response against ground truth</w:t>
+              <w:t>What It Evaluates</w:t>
             </w:r>
           </w:p>
         </w:tc>
@@ -1624,7 +1481,7 @@
                 <w:rFonts w:ascii="Inconsolata" w:hAnsi="Inconsolata"/>
                 <w:sz w:val="20"/>
               </w:rPr>
-              <w:t>answer_relevancy</w:t>
+              <w:t>Reasoning Depth</w:t>
             </w:r>
           </w:p>
         </w:tc>
@@ -1639,7 +1496,7 @@
                 <w:rFonts w:ascii="Inconsolata" w:hAnsi="Inconsolata"/>
                 <w:sz w:val="20"/>
               </w:rPr>
-              <w:t>All responses</w:t>
+              <w:t>0–3</w:t>
             </w:r>
           </w:p>
         </w:tc>
@@ -1654,7 +1511,7 @@
                 <w:rFonts w:ascii="Inconsolata" w:hAnsi="Inconsolata"/>
                 <w:sz w:val="20"/>
               </w:rPr>
-              <w:t>Whether the response addresses the question asked</w:t>
+              <w:t>(1) Clause-specific citations from retrieved context, (2) conditional analysis (if-then logic for compliance scenarios), (3) actionable steps for the CIIO. The judge determines which criteria are applicable per question type.</w:t>
             </w:r>
           </w:p>
         </w:tc>
@@ -1671,7 +1528,7 @@
                 <w:rFonts w:ascii="Inconsolata" w:hAnsi="Inconsolata"/>
                 <w:sz w:val="20"/>
               </w:rPr>
-              <w:t>faithfulness</w:t>
+              <w:t>Hallucination Detection</w:t>
             </w:r>
           </w:p>
         </w:tc>
@@ -1686,7 +1543,7 @@
                 <w:rFonts w:ascii="Inconsolata" w:hAnsi="Inconsolata"/>
                 <w:sz w:val="20"/>
               </w:rPr>
-              <w:t>RAG responses only</w:t>
+              <w:t>Binary (pass/fail)</w:t>
             </w:r>
           </w:p>
         </w:tc>
@@ -1701,800 +1558,22 @@
                 <w:rFonts w:ascii="Inconsolata" w:hAnsi="Inconsolata"/>
                 <w:sz w:val="20"/>
               </w:rPr>
-              <w:t>Whether the response is supported by the retrieved context (no hallucinated claims beyond what was retrieved)</w:t>
-            </w:r>
-          </w:p>
-        </w:tc>
-      </w:tr>
-      <w:tr>
-        <w:tc>
-          <w:tcPr>
-            <w:tcW w:type="dxa" w:w="4320"/>
-          </w:tcPr>
-          <w:p>
-            <w:r/>
-            <w:r>
-              <w:rPr>
-                <w:rFonts w:ascii="Inconsolata" w:hAnsi="Inconsolata"/>
-                <w:sz w:val="20"/>
-              </w:rPr>
-              <w:t>context_precision</w:t>
-            </w:r>
-          </w:p>
-        </w:tc>
-        <w:tc>
-          <w:tcPr>
-            <w:tcW w:type="dxa" w:w="4320"/>
-          </w:tcPr>
-          <w:p>
-            <w:r/>
-            <w:r>
-              <w:rPr>
-                <w:rFonts w:ascii="Inconsolata" w:hAnsi="Inconsolata"/>
-                <w:sz w:val="20"/>
-              </w:rPr>
-              <w:t>RAG responses only</w:t>
-            </w:r>
-          </w:p>
-        </w:tc>
-        <w:tc>
-          <w:tcPr>
-            <w:tcW w:type="dxa" w:w="4320"/>
-          </w:tcPr>
-          <w:p>
-            <w:r/>
-            <w:r>
-              <w:rPr>
-                <w:rFonts w:ascii="Inconsolata" w:hAnsi="Inconsolata"/>
-                <w:sz w:val="20"/>
-              </w:rPr>
-              <w:t>Whether the retrieved chunks are relevant to the question</w:t>
-            </w:r>
-          </w:p>
-        </w:tc>
-      </w:tr>
-      <w:tr>
-        <w:tc>
-          <w:tcPr>
-            <w:tcW w:type="dxa" w:w="4320"/>
-          </w:tcPr>
-          <w:p>
-            <w:r/>
-            <w:r>
-              <w:rPr>
-                <w:rFonts w:ascii="Inconsolata" w:hAnsi="Inconsolata"/>
-                <w:sz w:val="20"/>
-              </w:rPr>
-              <w:t>context_recall</w:t>
-            </w:r>
-          </w:p>
-        </w:tc>
-        <w:tc>
-          <w:tcPr>
-            <w:tcW w:type="dxa" w:w="4320"/>
-          </w:tcPr>
-          <w:p>
-            <w:r/>
-            <w:r>
-              <w:rPr>
-                <w:rFonts w:ascii="Inconsolata" w:hAnsi="Inconsolata"/>
-                <w:sz w:val="20"/>
-              </w:rPr>
-              <w:t>RAG responses only</w:t>
-            </w:r>
-          </w:p>
-        </w:tc>
-        <w:tc>
-          <w:tcPr>
-            <w:tcW w:type="dxa" w:w="4320"/>
-          </w:tcPr>
-          <w:p>
-            <w:r/>
-            <w:r>
-              <w:rPr>
-                <w:rFonts w:ascii="Inconsolata" w:hAnsi="Inconsolata"/>
-                <w:sz w:val="20"/>
-              </w:rPr>
-              <w:t>Whether the retrieved chunks contain the information needed to answer correctly</w:t>
+              <w:t>Claim-level verification against retrieved contexts. Each claim is classified as SUPPORTED, UNSUPPORTED, or CONTRADICTED. Any unsupported or contradicted claim fails the entire response.</w:t>
             </w:r>
           </w:p>
         </w:tc>
       </w:tr>
     </w:tbl>
-    <w:p/>
     <w:p>
+      <w:pPr/>
       <w:r>
         <w:rPr>
           <w:rFonts w:ascii="Inconsolata" w:hAnsi="Inconsolata"/>
           <w:sz w:val="26"/>
         </w:rPr>
-        <w:t>For non-RAG (model-only) responses, only the two base metrics (answer_correctness, answer_relevancy) are evaluated. For RAG-augmented responses, all 5 metrics are evaluated. This distinction allows direct comparison of model-only versus RAG-augmented response quality across the same test cases.</w:t>
+        <w:t>For LLM-only mode, retrieval contexts are fetched but only passed to the judge — not the model — enabling consistent hallucination scoring across both evaluation modes.</w:t>
       </w:r>
     </w:p>
-    <w:p>
-      <w:r>
-        <w:rPr>
-          <w:rFonts w:ascii="Inconsolata" w:hAnsi="Inconsolata"/>
-          <w:b/>
-          <w:sz w:val="26"/>
-        </w:rPr>
-        <w:t>Updated Benchmark Scoring Methods</w:t>
-      </w:r>
-    </w:p>
-    <w:tbl>
-      <w:tblPr>
-        <w:tblStyle w:val="TableGrid"/>
-        <w:tblW w:type="auto" w:w="0"/>
-        <w:jc w:val="left"/>
-        <w:tblLook w:firstColumn="1" w:firstRow="1" w:lastColumn="0" w:lastRow="0" w:noHBand="0" w:noVBand="1" w:val="04A0"/>
-      </w:tblPr>
-      <w:tblGrid>
-        <w:gridCol w:w="4320"/>
-        <w:gridCol w:w="4320"/>
-        <w:gridCol w:w="4320"/>
-      </w:tblGrid>
-      <w:tr>
-        <w:tc>
-          <w:tcPr>
-            <w:tcW w:type="dxa" w:w="4320"/>
-            <w:shd w:fill="D9E2F3" w:val="clear"/>
-          </w:tcPr>
-          <w:p>
-            <w:r/>
-            <w:r>
-              <w:rPr>
-                <w:rFonts w:ascii="Inconsolata" w:hAnsi="Inconsolata"/>
-                <w:b/>
-                <w:sz w:val="20"/>
-              </w:rPr>
-              <w:t>Benchmark</w:t>
-            </w:r>
-          </w:p>
-        </w:tc>
-        <w:tc>
-          <w:tcPr>
-            <w:tcW w:type="dxa" w:w="4320"/>
-            <w:shd w:fill="D9E2F3" w:val="clear"/>
-          </w:tcPr>
-          <w:p>
-            <w:r/>
-            <w:r>
-              <w:rPr>
-                <w:rFonts w:ascii="Inconsolata" w:hAnsi="Inconsolata"/>
-                <w:b/>
-                <w:sz w:val="20"/>
-              </w:rPr>
-              <w:t>Scoring Method</w:t>
-            </w:r>
-          </w:p>
-        </w:tc>
-        <w:tc>
-          <w:tcPr>
-            <w:tcW w:type="dxa" w:w="4320"/>
-            <w:shd w:fill="D9E2F3" w:val="clear"/>
-          </w:tcPr>
-          <w:p>
-            <w:r/>
-            <w:r>
-              <w:rPr>
-                <w:rFonts w:ascii="Inconsolata" w:hAnsi="Inconsolata"/>
-                <w:b/>
-                <w:sz w:val="20"/>
-              </w:rPr>
-              <w:t>Change from Term 1</w:t>
-            </w:r>
-          </w:p>
-        </w:tc>
-      </w:tr>
-      <w:tr>
-        <w:tc>
-          <w:tcPr>
-            <w:tcW w:type="dxa" w:w="4320"/>
-          </w:tcPr>
-          <w:p>
-            <w:r/>
-            <w:r>
-              <w:rPr>
-                <w:rFonts w:ascii="Inconsolata" w:hAnsi="Inconsolata"/>
-                <w:sz w:val="20"/>
-              </w:rPr>
-              <w:t>B1, B2, B4, B5, B6</w:t>
-            </w:r>
-          </w:p>
-        </w:tc>
-        <w:tc>
-          <w:tcPr>
-            <w:tcW w:type="dxa" w:w="4320"/>
-          </w:tcPr>
-          <w:p>
-            <w:r/>
-            <w:r>
-              <w:rPr>
-                <w:rFonts w:ascii="Inconsolata" w:hAnsi="Inconsolata"/>
-                <w:sz w:val="20"/>
-              </w:rPr>
-              <w:t>Rule-based (label matching)</w:t>
-            </w:r>
-          </w:p>
-        </w:tc>
-        <w:tc>
-          <w:tcPr>
-            <w:tcW w:type="dxa" w:w="4320"/>
-          </w:tcPr>
-          <w:p>
-            <w:r/>
-            <w:r>
-              <w:rPr>
-                <w:rFonts w:ascii="Inconsolata" w:hAnsi="Inconsolata"/>
-                <w:sz w:val="20"/>
-              </w:rPr>
-              <w:t>Unchanged</w:t>
-            </w:r>
-          </w:p>
-        </w:tc>
-      </w:tr>
-      <w:tr>
-        <w:tc>
-          <w:tcPr>
-            <w:tcW w:type="dxa" w:w="4320"/>
-          </w:tcPr>
-          <w:p>
-            <w:r/>
-            <w:r>
-              <w:rPr>
-                <w:rFonts w:ascii="Inconsolata" w:hAnsi="Inconsolata"/>
-                <w:sz w:val="20"/>
-              </w:rPr>
-              <w:t>B21</w:t>
-            </w:r>
-          </w:p>
-        </w:tc>
-        <w:tc>
-          <w:tcPr>
-            <w:tcW w:type="dxa" w:w="4320"/>
-          </w:tcPr>
-          <w:p>
-            <w:r/>
-            <w:r>
-              <w:rPr>
-                <w:rFonts w:ascii="Inconsolata" w:hAnsi="Inconsolata"/>
-                <w:sz w:val="20"/>
-              </w:rPr>
-              <w:t>Rule-based (hallucination detection)</w:t>
-            </w:r>
-          </w:p>
-        </w:tc>
-        <w:tc>
-          <w:tcPr>
-            <w:tcW w:type="dxa" w:w="4320"/>
-          </w:tcPr>
-          <w:p>
-            <w:r/>
-            <w:r>
-              <w:rPr>
-                <w:rFonts w:ascii="Inconsolata" w:hAnsi="Inconsolata"/>
-                <w:sz w:val="20"/>
-              </w:rPr>
-              <w:t>Unchanged</w:t>
-            </w:r>
-          </w:p>
-        </w:tc>
-      </w:tr>
-      <w:tr>
-        <w:tc>
-          <w:tcPr>
-            <w:tcW w:type="dxa" w:w="4320"/>
-          </w:tcPr>
-          <w:p>
-            <w:r/>
-            <w:r>
-              <w:rPr>
-                <w:rFonts w:ascii="Inconsolata" w:hAnsi="Inconsolata"/>
-                <w:sz w:val="20"/>
-              </w:rPr>
-              <w:t>B3</w:t>
-            </w:r>
-          </w:p>
-        </w:tc>
-        <w:tc>
-          <w:tcPr>
-            <w:tcW w:type="dxa" w:w="4320"/>
-          </w:tcPr>
-          <w:p>
-            <w:r/>
-            <w:r>
-              <w:rPr>
-                <w:rFonts w:ascii="Inconsolata" w:hAnsi="Inconsolata"/>
-                <w:sz w:val="20"/>
-              </w:rPr>
-              <w:t>LLM-as-Judge</w:t>
-            </w:r>
-          </w:p>
-        </w:tc>
-        <w:tc>
-          <w:tcPr>
-            <w:tcW w:type="dxa" w:w="4320"/>
-          </w:tcPr>
-          <w:p>
-            <w:r/>
-            <w:r>
-              <w:rPr>
-                <w:rFonts w:ascii="Inconsolata" w:hAnsi="Inconsolata"/>
-                <w:sz w:val="20"/>
-              </w:rPr>
-              <w:t>Was: hallucination misuse scoring</w:t>
-            </w:r>
-          </w:p>
-        </w:tc>
-      </w:tr>
-      <w:tr>
-        <w:tc>
-          <w:tcPr>
-            <w:tcW w:type="dxa" w:w="4320"/>
-          </w:tcPr>
-          <w:p>
-            <w:r/>
-            <w:r>
-              <w:rPr>
-                <w:rFonts w:ascii="Inconsolata" w:hAnsi="Inconsolata"/>
-                <w:sz w:val="20"/>
-              </w:rPr>
-              <w:t>B7, B10, B14, B16</w:t>
-            </w:r>
-          </w:p>
-        </w:tc>
-        <w:tc>
-          <w:tcPr>
-            <w:tcW w:type="dxa" w:w="4320"/>
-          </w:tcPr>
-          <w:p>
-            <w:r/>
-            <w:r>
-              <w:rPr>
-                <w:rFonts w:ascii="Inconsolata" w:hAnsi="Inconsolata"/>
-                <w:sz w:val="20"/>
-              </w:rPr>
-              <w:t>LLM-as-Judge</w:t>
-            </w:r>
-          </w:p>
-        </w:tc>
-        <w:tc>
-          <w:tcPr>
-            <w:tcW w:type="dxa" w:w="4320"/>
-          </w:tcPr>
-          <w:p>
-            <w:r/>
-            <w:r>
-              <w:rPr>
-                <w:rFonts w:ascii="Inconsolata" w:hAnsi="Inconsolata"/>
-                <w:sz w:val="20"/>
-              </w:rPr>
-              <w:t>Was: not implemented</w:t>
-            </w:r>
-          </w:p>
-        </w:tc>
-      </w:tr>
-      <w:tr>
-        <w:tc>
-          <w:tcPr>
-            <w:tcW w:type="dxa" w:w="4320"/>
-          </w:tcPr>
-          <w:p>
-            <w:r/>
-            <w:r>
-              <w:rPr>
-                <w:rFonts w:ascii="Inconsolata" w:hAnsi="Inconsolata"/>
-                <w:sz w:val="20"/>
-              </w:rPr>
-              <w:t>B8, B9, B11, B15, B17, B18, B19</w:t>
-            </w:r>
-          </w:p>
-        </w:tc>
-        <w:tc>
-          <w:tcPr>
-            <w:tcW w:type="dxa" w:w="4320"/>
-          </w:tcPr>
-          <w:p>
-            <w:r/>
-            <w:r>
-              <w:rPr>
-                <w:rFonts w:ascii="Inconsolata" w:hAnsi="Inconsolata"/>
-                <w:sz w:val="20"/>
-              </w:rPr>
-              <w:t>LLM-as-Judge</w:t>
-            </w:r>
-          </w:p>
-        </w:tc>
-        <w:tc>
-          <w:tcPr>
-            <w:tcW w:type="dxa" w:w="4320"/>
-          </w:tcPr>
-          <w:p>
-            <w:r/>
-            <w:r>
-              <w:rPr>
-                <w:rFonts w:ascii="Inconsolata" w:hAnsi="Inconsolata"/>
-                <w:sz w:val="20"/>
-              </w:rPr>
-              <w:t>Was: semantic similarity</w:t>
-            </w:r>
-          </w:p>
-        </w:tc>
-      </w:tr>
-      <w:tr>
-        <w:tc>
-          <w:tcPr>
-            <w:tcW w:type="dxa" w:w="4320"/>
-          </w:tcPr>
-          <w:p>
-            <w:r/>
-            <w:r>
-              <w:rPr>
-                <w:rFonts w:ascii="Inconsolata" w:hAnsi="Inconsolata"/>
-                <w:sz w:val="20"/>
-              </w:rPr>
-              <w:t>B12, B13, B20</w:t>
-            </w:r>
-          </w:p>
-        </w:tc>
-        <w:tc>
-          <w:tcPr>
-            <w:tcW w:type="dxa" w:w="4320"/>
-          </w:tcPr>
-          <w:p>
-            <w:r/>
-            <w:r>
-              <w:rPr>
-                <w:rFonts w:ascii="Inconsolata" w:hAnsi="Inconsolata"/>
-                <w:sz w:val="20"/>
-              </w:rPr>
-              <w:t>LLM-as-Judge</w:t>
-            </w:r>
-          </w:p>
-        </w:tc>
-        <w:tc>
-          <w:tcPr>
-            <w:tcW w:type="dxa" w:w="4320"/>
-          </w:tcPr>
-          <w:p>
-            <w:r/>
-            <w:r>
-              <w:rPr>
-                <w:rFonts w:ascii="Inconsolata" w:hAnsi="Inconsolata"/>
-                <w:sz w:val="20"/>
-              </w:rPr>
-              <w:t>Was: LLM-as-Judge (upgraded with rubrics)</w:t>
-            </w:r>
-          </w:p>
-        </w:tc>
-      </w:tr>
-    </w:tbl>
-    <w:p/>
-    <w:p>
-      <w:r>
-        <w:rPr>
-          <w:rFonts w:ascii="Inconsolata" w:hAnsi="Inconsolata"/>
-          <w:sz w:val="26"/>
-        </w:rPr>
-      </w:r>
-      <w:r>
-        <w:rPr>
-          <w:rFonts w:ascii="Inconsolata" w:hAnsi="Inconsolata"/>
-          <w:b/>
-          <w:sz w:val="26"/>
-        </w:rPr>
-        <w:t>Evaluation Category Weights</w:t>
-      </w:r>
-      <w:r>
-        <w:rPr>
-          <w:rFonts w:ascii="Inconsolata" w:hAnsi="Inconsolata"/>
-          <w:sz w:val="26"/>
-        </w:rPr>
-        <w:t xml:space="preserve"> (unchanged from Term 1)</w:t>
-      </w:r>
-    </w:p>
-    <w:tbl>
-      <w:tblPr>
-        <w:tblStyle w:val="TableGrid"/>
-        <w:tblW w:type="auto" w:w="0"/>
-        <w:jc w:val="left"/>
-        <w:tblLook w:firstColumn="1" w:firstRow="1" w:lastColumn="0" w:lastRow="0" w:noHBand="0" w:noVBand="1" w:val="04A0"/>
-      </w:tblPr>
-      <w:tblGrid>
-        <w:gridCol w:w="4320"/>
-        <w:gridCol w:w="4320"/>
-        <w:gridCol w:w="4320"/>
-      </w:tblGrid>
-      <w:tr>
-        <w:tc>
-          <w:tcPr>
-            <w:tcW w:type="dxa" w:w="4320"/>
-            <w:shd w:fill="D9E2F3" w:val="clear"/>
-          </w:tcPr>
-          <w:p>
-            <w:r/>
-            <w:r>
-              <w:rPr>
-                <w:rFonts w:ascii="Inconsolata" w:hAnsi="Inconsolata"/>
-                <w:b/>
-                <w:sz w:val="20"/>
-              </w:rPr>
-              <w:t>Category</w:t>
-            </w:r>
-          </w:p>
-        </w:tc>
-        <w:tc>
-          <w:tcPr>
-            <w:tcW w:type="dxa" w:w="4320"/>
-            <w:shd w:fill="D9E2F3" w:val="clear"/>
-          </w:tcPr>
-          <w:p>
-            <w:r/>
-            <w:r>
-              <w:rPr>
-                <w:rFonts w:ascii="Inconsolata" w:hAnsi="Inconsolata"/>
-                <w:b/>
-                <w:sz w:val="20"/>
-              </w:rPr>
-              <w:t>Weight</w:t>
-            </w:r>
-          </w:p>
-        </w:tc>
-        <w:tc>
-          <w:tcPr>
-            <w:tcW w:type="dxa" w:w="4320"/>
-            <w:shd w:fill="D9E2F3" w:val="clear"/>
-          </w:tcPr>
-          <w:p>
-            <w:r/>
-            <w:r>
-              <w:rPr>
-                <w:rFonts w:ascii="Inconsolata" w:hAnsi="Inconsolata"/>
-                <w:b/>
-                <w:sz w:val="20"/>
-              </w:rPr>
-              <w:t>Benchmarks</w:t>
-            </w:r>
-          </w:p>
-        </w:tc>
-      </w:tr>
-      <w:tr>
-        <w:tc>
-          <w:tcPr>
-            <w:tcW w:type="dxa" w:w="4320"/>
-          </w:tcPr>
-          <w:p>
-            <w:r/>
-            <w:r>
-              <w:rPr>
-                <w:rFonts w:ascii="Inconsolata" w:hAnsi="Inconsolata"/>
-                <w:sz w:val="20"/>
-              </w:rPr>
-              <w:t>Regulatory Applicability &amp; Interpretation</w:t>
-            </w:r>
-          </w:p>
-        </w:tc>
-        <w:tc>
-          <w:tcPr>
-            <w:tcW w:type="dxa" w:w="4320"/>
-          </w:tcPr>
-          <w:p>
-            <w:r/>
-            <w:r>
-              <w:rPr>
-                <w:rFonts w:ascii="Inconsolata" w:hAnsi="Inconsolata"/>
-                <w:sz w:val="20"/>
-              </w:rPr>
-              <w:t>25%</w:t>
-            </w:r>
-          </w:p>
-        </w:tc>
-        <w:tc>
-          <w:tcPr>
-            <w:tcW w:type="dxa" w:w="4320"/>
-          </w:tcPr>
-          <w:p>
-            <w:r/>
-            <w:r>
-              <w:rPr>
-                <w:rFonts w:ascii="Inconsolata" w:hAnsi="Inconsolata"/>
-                <w:sz w:val="20"/>
-              </w:rPr>
-              <w:t>B1–B5</w:t>
-            </w:r>
-          </w:p>
-        </w:tc>
-      </w:tr>
-      <w:tr>
-        <w:tc>
-          <w:tcPr>
-            <w:tcW w:type="dxa" w:w="4320"/>
-          </w:tcPr>
-          <w:p>
-            <w:r/>
-            <w:r>
-              <w:rPr>
-                <w:rFonts w:ascii="Inconsolata" w:hAnsi="Inconsolata"/>
-                <w:sz w:val="20"/>
-              </w:rPr>
-              <w:t>Compliance &amp; Risk Reasoning</w:t>
-            </w:r>
-          </w:p>
-        </w:tc>
-        <w:tc>
-          <w:tcPr>
-            <w:tcW w:type="dxa" w:w="4320"/>
-          </w:tcPr>
-          <w:p>
-            <w:r/>
-            <w:r>
-              <w:rPr>
-                <w:rFonts w:ascii="Inconsolata" w:hAnsi="Inconsolata"/>
-                <w:sz w:val="20"/>
-              </w:rPr>
-              <w:t>25%</w:t>
-            </w:r>
-          </w:p>
-        </w:tc>
-        <w:tc>
-          <w:tcPr>
-            <w:tcW w:type="dxa" w:w="4320"/>
-          </w:tcPr>
-          <w:p>
-            <w:r/>
-            <w:r>
-              <w:rPr>
-                <w:rFonts w:ascii="Inconsolata" w:hAnsi="Inconsolata"/>
-                <w:sz w:val="20"/>
-              </w:rPr>
-              <w:t>B6–B12</w:t>
-            </w:r>
-          </w:p>
-        </w:tc>
-      </w:tr>
-      <w:tr>
-        <w:tc>
-          <w:tcPr>
-            <w:tcW w:type="dxa" w:w="4320"/>
-          </w:tcPr>
-          <w:p>
-            <w:r/>
-            <w:r>
-              <w:rPr>
-                <w:rFonts w:ascii="Inconsolata" w:hAnsi="Inconsolata"/>
-                <w:sz w:val="20"/>
-              </w:rPr>
-              <w:t>Remediation &amp; Audit Reasoning</w:t>
-            </w:r>
-          </w:p>
-        </w:tc>
-        <w:tc>
-          <w:tcPr>
-            <w:tcW w:type="dxa" w:w="4320"/>
-          </w:tcPr>
-          <w:p>
-            <w:r/>
-            <w:r>
-              <w:rPr>
-                <w:rFonts w:ascii="Inconsolata" w:hAnsi="Inconsolata"/>
-                <w:sz w:val="20"/>
-              </w:rPr>
-              <w:t>20%</w:t>
-            </w:r>
-          </w:p>
-        </w:tc>
-        <w:tc>
-          <w:tcPr>
-            <w:tcW w:type="dxa" w:w="4320"/>
-          </w:tcPr>
-          <w:p>
-            <w:r/>
-            <w:r>
-              <w:rPr>
-                <w:rFonts w:ascii="Inconsolata" w:hAnsi="Inconsolata"/>
-                <w:sz w:val="20"/>
-              </w:rPr>
-              <w:t>B13–B16</w:t>
-            </w:r>
-          </w:p>
-        </w:tc>
-      </w:tr>
-      <w:tr>
-        <w:tc>
-          <w:tcPr>
-            <w:tcW w:type="dxa" w:w="4320"/>
-          </w:tcPr>
-          <w:p>
-            <w:r/>
-            <w:r>
-              <w:rPr>
-                <w:rFonts w:ascii="Inconsolata" w:hAnsi="Inconsolata"/>
-                <w:sz w:val="20"/>
-              </w:rPr>
-              <w:t>Governance &amp; Consistency (SG Context)</w:t>
-            </w:r>
-          </w:p>
-        </w:tc>
-        <w:tc>
-          <w:tcPr>
-            <w:tcW w:type="dxa" w:w="4320"/>
-          </w:tcPr>
-          <w:p>
-            <w:r/>
-            <w:r>
-              <w:rPr>
-                <w:rFonts w:ascii="Inconsolata" w:hAnsi="Inconsolata"/>
-                <w:sz w:val="20"/>
-              </w:rPr>
-              <w:t>10%</w:t>
-            </w:r>
-          </w:p>
-        </w:tc>
-        <w:tc>
-          <w:tcPr>
-            <w:tcW w:type="dxa" w:w="4320"/>
-          </w:tcPr>
-          <w:p>
-            <w:r/>
-            <w:r>
-              <w:rPr>
-                <w:rFonts w:ascii="Inconsolata" w:hAnsi="Inconsolata"/>
-                <w:sz w:val="20"/>
-              </w:rPr>
-              <w:t>B17–B19</w:t>
-            </w:r>
-          </w:p>
-        </w:tc>
-      </w:tr>
-      <w:tr>
-        <w:tc>
-          <w:tcPr>
-            <w:tcW w:type="dxa" w:w="4320"/>
-          </w:tcPr>
-          <w:p>
-            <w:r/>
-            <w:r>
-              <w:rPr>
-                <w:rFonts w:ascii="Inconsolata" w:hAnsi="Inconsolata"/>
-                <w:sz w:val="20"/>
-              </w:rPr>
-              <w:t>Safety &amp; Regulatory Grounding</w:t>
-            </w:r>
-          </w:p>
-        </w:tc>
-        <w:tc>
-          <w:tcPr>
-            <w:tcW w:type="dxa" w:w="4320"/>
-          </w:tcPr>
-          <w:p>
-            <w:r/>
-            <w:r>
-              <w:rPr>
-                <w:rFonts w:ascii="Inconsolata" w:hAnsi="Inconsolata"/>
-                <w:sz w:val="20"/>
-              </w:rPr>
-              <w:t>20%</w:t>
-            </w:r>
-          </w:p>
-        </w:tc>
-        <w:tc>
-          <w:tcPr>
-            <w:tcW w:type="dxa" w:w="4320"/>
-          </w:tcPr>
-          <w:p>
-            <w:r/>
-            <w:r>
-              <w:rPr>
-                <w:rFonts w:ascii="Inconsolata" w:hAnsi="Inconsolata"/>
-                <w:sz w:val="20"/>
-              </w:rPr>
-              <w:t>B20–B21</w:t>
-            </w:r>
-          </w:p>
-        </w:tc>
-      </w:tr>
-    </w:tbl>
-    <w:p/>
     <w:p>
       <w:pPr>
         <w:pStyle w:val="Heading1"/>
@@ -3923,6 +3002,1088 @@
     </w:p>
     <w:p>
       <w:pPr>
+        <w:pStyle w:val="Heading3"/>
+      </w:pPr>
+      <w:r>
+        <w:rPr>
+          <w:rFonts w:ascii="Inconsolata" w:hAnsi="Inconsolata"/>
+          <w:b/>
+          <w:color w:val="4F81BD"/>
+          <w:sz w:val="30"/>
+        </w:rPr>
+        <w:t>7.1.1 Hallucination Reduction</w:t>
+      </w:r>
+    </w:p>
+    <w:p>
+      <w:pPr/>
+      <w:r>
+        <w:rPr>
+          <w:rFonts w:ascii="Inconsolata" w:hAnsi="Inconsolata"/>
+          <w:sz w:val="26"/>
+        </w:rPr>
+        <w:t>Test case B21-004 is designed to test hallucination resistance by asking about a non-existent clause — Clause 7.4.5 does not appear in CCoP 2.0. The expected behaviour is for the model to recognise this and decline to fabricate an answer.</w:t>
+      </w:r>
+    </w:p>
+    <w:p>
+      <w:pPr/>
+      <w:r>
+        <w:rPr>
+          <w:rFonts w:ascii="Courier New" w:hAnsi="Courier New"/>
+          <w:color w:val="333333"/>
+          <w:sz w:val="22"/>
+        </w:rPr>
+        <w:t>ccop-eval evaluate run --model primus-reasoning --benchmarks B21 --test-ids B21-004 --judge-mode universal --mode hybrid</w:t>
+      </w:r>
+    </w:p>
+    <w:p>
+      <w:pPr/>
+      <w:r>
+        <w:rPr>
+          <w:rFonts w:ascii="Courier New" w:hAnsi="Courier New"/>
+          <w:color w:val="333333"/>
+          <w:sz w:val="22"/>
+        </w:rPr>
+        <w:t>ccop-eval evaluate run --model primus-reasoning --benchmarks B21 --test-ids B21-004 --judge-mode universal --mode llm-only</w:t>
+      </w:r>
+    </w:p>
+    <w:tbl>
+      <w:tblPr>
+        <w:tblStyle w:val="TableGrid"/>
+        <w:tblW w:type="auto" w:w="0"/>
+        <w:tblLook w:firstColumn="1" w:firstRow="1" w:lastColumn="0" w:lastRow="0" w:noHBand="0" w:noVBand="1" w:val="04A0"/>
+      </w:tblPr>
+      <w:tblGrid>
+        <w:gridCol w:w="4320"/>
+        <w:gridCol w:w="4320"/>
+        <w:gridCol w:w="4320"/>
+      </w:tblGrid>
+      <w:tr>
+        <w:tc>
+          <w:tcPr>
+            <w:tcW w:type="dxa" w:w="4320"/>
+          </w:tcPr>
+          <w:p>
+            <w:r/>
+            <w:r>
+              <w:rPr>
+                <w:rFonts w:ascii="Inconsolata" w:hAnsi="Inconsolata"/>
+                <w:b/>
+                <w:sz w:val="20"/>
+              </w:rPr>
+              <w:t>Aspect</w:t>
+            </w:r>
+          </w:p>
+        </w:tc>
+        <w:tc>
+          <w:tcPr>
+            <w:tcW w:type="dxa" w:w="4320"/>
+          </w:tcPr>
+          <w:p>
+            <w:r/>
+            <w:r>
+              <w:rPr>
+                <w:rFonts w:ascii="Inconsolata" w:hAnsi="Inconsolata"/>
+                <w:b/>
+                <w:sz w:val="20"/>
+              </w:rPr>
+              <w:t>hybrid (RAG-augmented)</w:t>
+            </w:r>
+          </w:p>
+        </w:tc>
+        <w:tc>
+          <w:tcPr>
+            <w:tcW w:type="dxa" w:w="4320"/>
+          </w:tcPr>
+          <w:p>
+            <w:r/>
+            <w:r>
+              <w:rPr>
+                <w:rFonts w:ascii="Inconsolata" w:hAnsi="Inconsolata"/>
+                <w:b/>
+                <w:sz w:val="20"/>
+              </w:rPr>
+              <w:t>llm-only (no retrieval)</w:t>
+            </w:r>
+          </w:p>
+        </w:tc>
+      </w:tr>
+      <w:tr>
+        <w:tc>
+          <w:tcPr>
+            <w:tcW w:type="dxa" w:w="4320"/>
+          </w:tcPr>
+          <w:p>
+            <w:r/>
+            <w:r>
+              <w:rPr>
+                <w:rFonts w:ascii="Inconsolata" w:hAnsi="Inconsolata"/>
+                <w:sz w:val="20"/>
+              </w:rPr>
+              <w:t>Response</w:t>
+            </w:r>
+          </w:p>
+        </w:tc>
+        <w:tc>
+          <w:tcPr>
+            <w:tcW w:type="dxa" w:w="4320"/>
+          </w:tcPr>
+          <w:p>
+            <w:r/>
+            <w:r>
+              <w:rPr>
+                <w:rFonts w:ascii="Inconsolata" w:hAnsi="Inconsolata"/>
+                <w:sz w:val="20"/>
+              </w:rPr>
+              <w:t>The provided retrieved context does not explicitly mention Clause 7.4.5 from CCoP 2.0, which pertains to the maximum allowable downtime for Critical Information Infrastructure (CII) systems during recovery from a cybersecurity incident. Given the available information, there is no specific clause or reference that addresses the "maximum allowable downtime" under Clause 7.4.5 within CCoP 2.0... Therefore, it's not possible to provide a definitive answer based on the current information.</w:t>
+            </w:r>
+          </w:p>
+        </w:tc>
+        <w:tc>
+          <w:tcPr>
+            <w:tcW w:type="dxa" w:w="4320"/>
+          </w:tcPr>
+          <w:p>
+            <w:r/>
+            <w:r>
+              <w:rPr>
+                <w:rFonts w:ascii="Inconsolata" w:hAnsi="Inconsolata"/>
+                <w:sz w:val="20"/>
+              </w:rPr>
+              <w:t>Without direct access to CCoP 2.0 documentation at this moment, my ability to cite the exact clause details is limited... Assuming CCoP 2.0 follows similar principles, the maximum allowable downtime would be aligned with the criticality of services provided by CII systems... The maximum allowable downtime is likely measured in hours rather than days, reflecting the importance of swift restoration to maintain operational continuity.</w:t>
+            </w:r>
+          </w:p>
+        </w:tc>
+      </w:tr>
+      <w:tr>
+        <w:tc>
+          <w:tcPr>
+            <w:tcW w:type="dxa" w:w="4320"/>
+          </w:tcPr>
+          <w:p>
+            <w:r/>
+            <w:r>
+              <w:rPr>
+                <w:rFonts w:ascii="Inconsolata" w:hAnsi="Inconsolata"/>
+                <w:sz w:val="20"/>
+              </w:rPr>
+              <w:t>Hallucination detected</w:t>
+            </w:r>
+          </w:p>
+        </w:tc>
+        <w:tc>
+          <w:tcPr>
+            <w:tcW w:type="dxa" w:w="4320"/>
+          </w:tcPr>
+          <w:p>
+            <w:r/>
+            <w:r>
+              <w:rPr>
+                <w:rFonts w:ascii="Inconsolata" w:hAnsi="Inconsolata"/>
+                <w:sz w:val="20"/>
+              </w:rPr>
+              <w:t>NO (4 claims: 0 unsupported, 0 contradicted)</w:t>
+            </w:r>
+          </w:p>
+        </w:tc>
+        <w:tc>
+          <w:tcPr>
+            <w:tcW w:type="dxa" w:w="4320"/>
+          </w:tcPr>
+          <w:p>
+            <w:r/>
+            <w:r>
+              <w:rPr>
+                <w:rFonts w:ascii="Inconsolata" w:hAnsi="Inconsolata"/>
+                <w:sz w:val="20"/>
+              </w:rPr>
+              <w:t>YES (5 claims: 4 unsupported, 0 contradicted)</w:t>
+            </w:r>
+          </w:p>
+        </w:tc>
+      </w:tr>
+      <w:tr>
+        <w:tc>
+          <w:tcPr>
+            <w:tcW w:type="dxa" w:w="4320"/>
+          </w:tcPr>
+          <w:p>
+            <w:r/>
+            <w:r>
+              <w:rPr>
+                <w:rFonts w:ascii="Inconsolata" w:hAnsi="Inconsolata"/>
+                <w:sz w:val="20"/>
+              </w:rPr>
+              <w:t>Behaviour</w:t>
+            </w:r>
+          </w:p>
+        </w:tc>
+        <w:tc>
+          <w:tcPr>
+            <w:tcW w:type="dxa" w:w="4320"/>
+          </w:tcPr>
+          <w:p>
+            <w:r/>
+            <w:r>
+              <w:rPr>
+                <w:rFonts w:ascii="Inconsolata" w:hAnsi="Inconsolata"/>
+                <w:sz w:val="20"/>
+              </w:rPr>
+              <w:t>Recognises clause is absent from retrieved context, declines to fabricate</w:t>
+            </w:r>
+          </w:p>
+        </w:tc>
+        <w:tc>
+          <w:tcPr>
+            <w:tcW w:type="dxa" w:w="4320"/>
+          </w:tcPr>
+          <w:p>
+            <w:r/>
+            <w:r>
+              <w:rPr>
+                <w:rFonts w:ascii="Inconsolata" w:hAnsi="Inconsolata"/>
+                <w:sz w:val="20"/>
+              </w:rPr>
+              <w:t>Speculates from general knowledge, references NIST SP 800-53, fabricates clause references (5.2.1, 3.4)</w:t>
+            </w:r>
+          </w:p>
+        </w:tc>
+      </w:tr>
+      <w:tr>
+        <w:tc>
+          <w:tcPr>
+            <w:tcW w:type="dxa" w:w="4320"/>
+          </w:tcPr>
+          <w:p>
+            <w:r/>
+            <w:r>
+              <w:rPr>
+                <w:rFonts w:ascii="Inconsolata" w:hAnsi="Inconsolata"/>
+                <w:sz w:val="20"/>
+              </w:rPr>
+              <w:t>Benchmark score</w:t>
+            </w:r>
+          </w:p>
+        </w:tc>
+        <w:tc>
+          <w:tcPr>
+            <w:tcW w:type="dxa" w:w="4320"/>
+          </w:tcPr>
+          <w:p>
+            <w:r/>
+            <w:r>
+              <w:rPr>
+                <w:rFonts w:ascii="Inconsolata" w:hAnsi="Inconsolata"/>
+                <w:sz w:val="20"/>
+              </w:rPr>
+              <w:t>0.33 (PASS)</w:t>
+            </w:r>
+          </w:p>
+        </w:tc>
+        <w:tc>
+          <w:tcPr>
+            <w:tcW w:type="dxa" w:w="4320"/>
+          </w:tcPr>
+          <w:p>
+            <w:r/>
+            <w:r>
+              <w:rPr>
+                <w:rFonts w:ascii="Inconsolata" w:hAnsi="Inconsolata"/>
+                <w:sz w:val="20"/>
+              </w:rPr>
+              <w:t>0.00 (FAIL)</w:t>
+            </w:r>
+          </w:p>
+        </w:tc>
+      </w:tr>
+      <w:tr>
+        <w:tc>
+          <w:tcPr>
+            <w:tcW w:type="dxa" w:w="4320"/>
+          </w:tcPr>
+          <w:p>
+            <w:r/>
+            <w:r>
+              <w:rPr>
+                <w:rFonts w:ascii="Inconsolata" w:hAnsi="Inconsolata"/>
+                <w:sz w:val="20"/>
+              </w:rPr>
+              <w:t>Reasoning depth</w:t>
+            </w:r>
+          </w:p>
+        </w:tc>
+        <w:tc>
+          <w:tcPr>
+            <w:tcW w:type="dxa" w:w="4320"/>
+          </w:tcPr>
+          <w:p>
+            <w:r/>
+            <w:r>
+              <w:rPr>
+                <w:rFonts w:ascii="Inconsolata" w:hAnsi="Inconsolata"/>
+                <w:sz w:val="20"/>
+              </w:rPr>
+              <w:t>Clause Citations: YES, Actionable Steps: NO</w:t>
+            </w:r>
+          </w:p>
+        </w:tc>
+        <w:tc>
+          <w:tcPr>
+            <w:tcW w:type="dxa" w:w="4320"/>
+          </w:tcPr>
+          <w:p>
+            <w:r/>
+            <w:r>
+              <w:rPr>
+                <w:rFonts w:ascii="Inconsolata" w:hAnsi="Inconsolata"/>
+                <w:sz w:val="20"/>
+              </w:rPr>
+              <w:t>Clause Citations: NO</w:t>
+            </w:r>
+          </w:p>
+        </w:tc>
+      </w:tr>
+      <w:tr>
+        <w:tc>
+          <w:tcPr>
+            <w:tcW w:type="dxa" w:w="4320"/>
+          </w:tcPr>
+          <w:p>
+            <w:r/>
+            <w:r>
+              <w:rPr>
+                <w:rFonts w:ascii="Inconsolata" w:hAnsi="Inconsolata"/>
+                <w:sz w:val="20"/>
+              </w:rPr>
+              <w:t>RAGAs score</w:t>
+            </w:r>
+          </w:p>
+        </w:tc>
+        <w:tc>
+          <w:tcPr>
+            <w:tcW w:type="dxa" w:w="4320"/>
+          </w:tcPr>
+          <w:p>
+            <w:r/>
+            <w:r>
+              <w:rPr>
+                <w:rFonts w:ascii="Inconsolata" w:hAnsi="Inconsolata"/>
+                <w:sz w:val="20"/>
+              </w:rPr>
+              <w:t>0.46</w:t>
+            </w:r>
+          </w:p>
+        </w:tc>
+        <w:tc>
+          <w:tcPr>
+            <w:tcW w:type="dxa" w:w="4320"/>
+          </w:tcPr>
+          <w:p>
+            <w:r/>
+            <w:r>
+              <w:rPr>
+                <w:rFonts w:ascii="Inconsolata" w:hAnsi="Inconsolata"/>
+                <w:sz w:val="20"/>
+              </w:rPr>
+              <w:t>0.45</w:t>
+            </w:r>
+          </w:p>
+        </w:tc>
+      </w:tr>
+      <w:tr>
+        <w:tc>
+          <w:tcPr>
+            <w:tcW w:type="dxa" w:w="4320"/>
+          </w:tcPr>
+          <w:p>
+            <w:r/>
+            <w:r>
+              <w:rPr>
+                <w:rFonts w:ascii="Inconsolata" w:hAnsi="Inconsolata"/>
+                <w:sz w:val="20"/>
+              </w:rPr>
+              <w:t>context_faithfulness</w:t>
+            </w:r>
+          </w:p>
+        </w:tc>
+        <w:tc>
+          <w:tcPr>
+            <w:tcW w:type="dxa" w:w="4320"/>
+          </w:tcPr>
+          <w:p>
+            <w:r/>
+            <w:r>
+              <w:rPr>
+                <w:rFonts w:ascii="Inconsolata" w:hAnsi="Inconsolata"/>
+                <w:sz w:val="20"/>
+              </w:rPr>
+              <w:t>0.89</w:t>
+            </w:r>
+          </w:p>
+        </w:tc>
+        <w:tc>
+          <w:tcPr>
+            <w:tcW w:type="dxa" w:w="4320"/>
+          </w:tcPr>
+          <w:p>
+            <w:r/>
+            <w:r>
+              <w:rPr>
+                <w:rFonts w:ascii="Inconsolata" w:hAnsi="Inconsolata"/>
+                <w:sz w:val="20"/>
+              </w:rPr>
+              <w:t>N/A</w:t>
+            </w:r>
+          </w:p>
+        </w:tc>
+      </w:tr>
+      <w:tr>
+        <w:tc>
+          <w:tcPr>
+            <w:tcW w:type="dxa" w:w="4320"/>
+          </w:tcPr>
+          <w:p>
+            <w:r/>
+            <w:r>
+              <w:rPr>
+                <w:rFonts w:ascii="Inconsolata" w:hAnsi="Inconsolata"/>
+                <w:sz w:val="20"/>
+              </w:rPr>
+              <w:t>factual_recall</w:t>
+            </w:r>
+          </w:p>
+        </w:tc>
+        <w:tc>
+          <w:tcPr>
+            <w:tcW w:type="dxa" w:w="4320"/>
+          </w:tcPr>
+          <w:p>
+            <w:r/>
+            <w:r>
+              <w:rPr>
+                <w:rFonts w:ascii="Inconsolata" w:hAnsi="Inconsolata"/>
+                <w:sz w:val="20"/>
+              </w:rPr>
+              <w:t>0.56</w:t>
+            </w:r>
+          </w:p>
+        </w:tc>
+        <w:tc>
+          <w:tcPr>
+            <w:tcW w:type="dxa" w:w="4320"/>
+          </w:tcPr>
+          <w:p>
+            <w:r/>
+            <w:r>
+              <w:rPr>
+                <w:rFonts w:ascii="Inconsolata" w:hAnsi="Inconsolata"/>
+                <w:sz w:val="20"/>
+              </w:rPr>
+              <w:t>0.54</w:t>
+            </w:r>
+          </w:p>
+        </w:tc>
+      </w:tr>
+      <w:tr>
+        <w:tc>
+          <w:tcPr>
+            <w:tcW w:type="dxa" w:w="4320"/>
+          </w:tcPr>
+          <w:p>
+            <w:r/>
+            <w:r>
+              <w:rPr>
+                <w:rFonts w:ascii="Inconsolata" w:hAnsi="Inconsolata"/>
+                <w:sz w:val="20"/>
+              </w:rPr>
+              <w:t>semantic_similarity</w:t>
+            </w:r>
+          </w:p>
+        </w:tc>
+        <w:tc>
+          <w:tcPr>
+            <w:tcW w:type="dxa" w:w="4320"/>
+          </w:tcPr>
+          <w:p>
+            <w:r/>
+            <w:r>
+              <w:rPr>
+                <w:rFonts w:ascii="Inconsolata" w:hAnsi="Inconsolata"/>
+                <w:sz w:val="20"/>
+              </w:rPr>
+              <w:t>0.81</w:t>
+            </w:r>
+          </w:p>
+        </w:tc>
+        <w:tc>
+          <w:tcPr>
+            <w:tcW w:type="dxa" w:w="4320"/>
+          </w:tcPr>
+          <w:p>
+            <w:r/>
+            <w:r>
+              <w:rPr>
+                <w:rFonts w:ascii="Inconsolata" w:hAnsi="Inconsolata"/>
+                <w:sz w:val="20"/>
+              </w:rPr>
+              <w:t>0.82</w:t>
+            </w:r>
+          </w:p>
+        </w:tc>
+      </w:tr>
+    </w:tbl>
+    <w:p>
+      <w:pPr/>
+      <w:r>
+        <w:rPr>
+          <w:rFonts w:ascii="Inconsolata" w:hAnsi="Inconsolata"/>
+          <w:sz w:val="26"/>
+        </w:rPr>
+        <w:t>The RAG-augmented response demonstrates the core value of retrieval grounding for hallucination resistance: when the retrieved context does not contain the requested clause, the model recognises this absence and declines to fabricate — producing zero unsupported claims. Without retrieval, the model defaults to speculative reasoning from general cybersecurity knowledge, generating 4 unsupported claims and failing the hallucination gate.</w:t>
+      </w:r>
+    </w:p>
+    <w:p>
+      <w:pPr>
+        <w:pStyle w:val="Heading3"/>
+      </w:pPr>
+      <w:r>
+        <w:rPr>
+          <w:rFonts w:ascii="Inconsolata" w:hAnsi="Inconsolata"/>
+          <w:b/>
+          <w:color w:val="4F81BD"/>
+          <w:sz w:val="30"/>
+        </w:rPr>
+        <w:t>7.1.2 Model Grounding &amp; Factual Recall</w:t>
+      </w:r>
+    </w:p>
+    <w:p>
+      <w:pPr/>
+      <w:r>
+        <w:rPr>
+          <w:rFonts w:ascii="Inconsolata" w:hAnsi="Inconsolata"/>
+          <w:sz w:val="26"/>
+        </w:rPr>
+        <w:t>Test case B3-001 evaluates conditional compliance reasoning — whether the model can apply specific CCoP clauses to a real-world scenario involving shared administrative accounts and compensating controls.</w:t>
+      </w:r>
+    </w:p>
+    <w:p>
+      <w:pPr/>
+      <w:r>
+        <w:rPr>
+          <w:rFonts w:ascii="Courier New" w:hAnsi="Courier New"/>
+          <w:color w:val="333333"/>
+          <w:sz w:val="22"/>
+        </w:rPr>
+        <w:t>ccop-eval evaluate run --model primus-reasoning --benchmarks B3 --test-ids B3-001 --judge-mode universal --mode hybrid</w:t>
+      </w:r>
+    </w:p>
+    <w:p>
+      <w:pPr/>
+      <w:r>
+        <w:rPr>
+          <w:rFonts w:ascii="Courier New" w:hAnsi="Courier New"/>
+          <w:color w:val="333333"/>
+          <w:sz w:val="22"/>
+        </w:rPr>
+        <w:t>ccop-eval evaluate run --model primus-reasoning --benchmarks B3 --test-ids B3-001 --judge-mode universal --mode llm-only</w:t>
+      </w:r>
+    </w:p>
+    <w:tbl>
+      <w:tblPr>
+        <w:tblStyle w:val="TableGrid"/>
+        <w:tblW w:type="auto" w:w="0"/>
+        <w:tblLook w:firstColumn="1" w:firstRow="1" w:lastColumn="0" w:lastRow="0" w:noHBand="0" w:noVBand="1" w:val="04A0"/>
+      </w:tblPr>
+      <w:tblGrid>
+        <w:gridCol w:w="4320"/>
+        <w:gridCol w:w="4320"/>
+        <w:gridCol w:w="4320"/>
+      </w:tblGrid>
+      <w:tr>
+        <w:tc>
+          <w:tcPr>
+            <w:tcW w:type="dxa" w:w="4320"/>
+          </w:tcPr>
+          <w:p>
+            <w:r/>
+            <w:r>
+              <w:rPr>
+                <w:rFonts w:ascii="Inconsolata" w:hAnsi="Inconsolata"/>
+                <w:b/>
+                <w:sz w:val="20"/>
+              </w:rPr>
+              <w:t>Aspect</w:t>
+            </w:r>
+          </w:p>
+        </w:tc>
+        <w:tc>
+          <w:tcPr>
+            <w:tcW w:type="dxa" w:w="4320"/>
+          </w:tcPr>
+          <w:p>
+            <w:r/>
+            <w:r>
+              <w:rPr>
+                <w:rFonts w:ascii="Inconsolata" w:hAnsi="Inconsolata"/>
+                <w:b/>
+                <w:sz w:val="20"/>
+              </w:rPr>
+              <w:t>hybrid (RAG-augmented)</w:t>
+            </w:r>
+          </w:p>
+        </w:tc>
+        <w:tc>
+          <w:tcPr>
+            <w:tcW w:type="dxa" w:w="4320"/>
+          </w:tcPr>
+          <w:p>
+            <w:r/>
+            <w:r>
+              <w:rPr>
+                <w:rFonts w:ascii="Inconsolata" w:hAnsi="Inconsolata"/>
+                <w:b/>
+                <w:sz w:val="20"/>
+              </w:rPr>
+              <w:t>llm-only (no retrieval)</w:t>
+            </w:r>
+          </w:p>
+        </w:tc>
+      </w:tr>
+      <w:tr>
+        <w:tc>
+          <w:tcPr>
+            <w:tcW w:type="dxa" w:w="4320"/>
+          </w:tcPr>
+          <w:p>
+            <w:r/>
+            <w:r>
+              <w:rPr>
+                <w:rFonts w:ascii="Inconsolata" w:hAnsi="Inconsolata"/>
+                <w:sz w:val="20"/>
+              </w:rPr>
+              <w:t>Response</w:t>
+            </w:r>
+          </w:p>
+        </w:tc>
+        <w:tc>
+          <w:tcPr>
+            <w:tcW w:type="dxa" w:w="4320"/>
+          </w:tcPr>
+          <w:p>
+            <w:r/>
+            <w:r>
+              <w:rPr>
+                <w:rFonts w:ascii="Inconsolata" w:hAnsi="Inconsolata"/>
+                <w:sz w:val="20"/>
+              </w:rPr>
+              <w:t>CCoP 2.0 mandates that the use of shared user accounts should be avoided unless absolutely necessary (Clause 5.2.1.c). It emphasizes the importance of minimizing privileges and monitoring all account activities... CCoP 2.0 requires multi-factor authentication for privileged accounts where privileges are escalated or accessed (Clause 5.3.1.c). Since the CIIO has not explicitly mentioned implementing MFA, this requirement is not fully met... The implementation of MFA is necessary to meet the specified standards.</w:t>
+            </w:r>
+          </w:p>
+        </w:tc>
+        <w:tc>
+          <w:tcPr>
+            <w:tcW w:type="dxa" w:w="4320"/>
+          </w:tcPr>
+          <w:p>
+            <w:r/>
+            <w:r>
+              <w:rPr>
+                <w:rFonts w:ascii="Inconsolata" w:hAnsi="Inconsolata"/>
+                <w:sz w:val="20"/>
+              </w:rPr>
+              <w:t>Upon reviewing the CCoP 2.0 framework, I recall that it emphasizes strong authentication mechanisms... specific clauses regarding shared administrative accounts and multi-factor authentication (MFA) are not immediately clear in my memory without direct reference to the document... For instance, Clause 6.5 of earlier CCoP versions might relate to access controls and authentication, but the exact alignment with MFA for shared accounts is uncertain.</w:t>
+            </w:r>
+          </w:p>
+        </w:tc>
+      </w:tr>
+      <w:tr>
+        <w:tc>
+          <w:tcPr>
+            <w:tcW w:type="dxa" w:w="4320"/>
+          </w:tcPr>
+          <w:p>
+            <w:r/>
+            <w:r>
+              <w:rPr>
+                <w:rFonts w:ascii="Inconsolata" w:hAnsi="Inconsolata"/>
+                <w:sz w:val="20"/>
+              </w:rPr>
+              <w:t>Hallucination detected</w:t>
+            </w:r>
+          </w:p>
+        </w:tc>
+        <w:tc>
+          <w:tcPr>
+            <w:tcW w:type="dxa" w:w="4320"/>
+          </w:tcPr>
+          <w:p>
+            <w:r/>
+            <w:r>
+              <w:rPr>
+                <w:rFonts w:ascii="Inconsolata" w:hAnsi="Inconsolata"/>
+                <w:sz w:val="20"/>
+              </w:rPr>
+              <w:t>NO (8 claims: 0 unsupported, 0 contradicted)</w:t>
+            </w:r>
+          </w:p>
+        </w:tc>
+        <w:tc>
+          <w:tcPr>
+            <w:tcW w:type="dxa" w:w="4320"/>
+          </w:tcPr>
+          <w:p>
+            <w:r/>
+            <w:r>
+              <w:rPr>
+                <w:rFonts w:ascii="Inconsolata" w:hAnsi="Inconsolata"/>
+                <w:sz w:val="20"/>
+              </w:rPr>
+              <w:t>YES (7 claims: 4 unsupported, 1 contradicted)</w:t>
+            </w:r>
+          </w:p>
+        </w:tc>
+      </w:tr>
+      <w:tr>
+        <w:tc>
+          <w:tcPr>
+            <w:tcW w:type="dxa" w:w="4320"/>
+          </w:tcPr>
+          <w:p>
+            <w:r/>
+            <w:r>
+              <w:rPr>
+                <w:rFonts w:ascii="Inconsolata" w:hAnsi="Inconsolata"/>
+                <w:sz w:val="20"/>
+              </w:rPr>
+              <w:t>Behaviour</w:t>
+            </w:r>
+          </w:p>
+        </w:tc>
+        <w:tc>
+          <w:tcPr>
+            <w:tcW w:type="dxa" w:w="4320"/>
+          </w:tcPr>
+          <w:p>
+            <w:r/>
+            <w:r>
+              <w:rPr>
+                <w:rFonts w:ascii="Inconsolata" w:hAnsi="Inconsolata"/>
+                <w:sz w:val="20"/>
+              </w:rPr>
+              <w:t>Cites specific clauses (5.2.1, 5.1.4, 5.2.2, 5.3.1.c), applies them to the scenario, recommends MFA implementation</w:t>
+            </w:r>
+          </w:p>
+        </w:tc>
+        <w:tc>
+          <w:tcPr>
+            <w:tcW w:type="dxa" w:w="4320"/>
+          </w:tcPr>
+          <w:p>
+            <w:r/>
+            <w:r>
+              <w:rPr>
+                <w:rFonts w:ascii="Inconsolata" w:hAnsi="Inconsolata"/>
+                <w:sz w:val="20"/>
+              </w:rPr>
+              <w:t>Hedges with "I recall", fabricates Clause 6.5, unable to reach a definitive compliance determination</w:t>
+            </w:r>
+          </w:p>
+        </w:tc>
+      </w:tr>
+      <w:tr>
+        <w:tc>
+          <w:tcPr>
+            <w:tcW w:type="dxa" w:w="4320"/>
+          </w:tcPr>
+          <w:p>
+            <w:r/>
+            <w:r>
+              <w:rPr>
+                <w:rFonts w:ascii="Inconsolata" w:hAnsi="Inconsolata"/>
+                <w:sz w:val="20"/>
+              </w:rPr>
+              <w:t>Benchmark score</w:t>
+            </w:r>
+          </w:p>
+        </w:tc>
+        <w:tc>
+          <w:tcPr>
+            <w:tcW w:type="dxa" w:w="4320"/>
+          </w:tcPr>
+          <w:p>
+            <w:r/>
+            <w:r>
+              <w:rPr>
+                <w:rFonts w:ascii="Inconsolata" w:hAnsi="Inconsolata"/>
+                <w:sz w:val="20"/>
+              </w:rPr>
+              <w:t>1.00 (PASS)</w:t>
+            </w:r>
+          </w:p>
+        </w:tc>
+        <w:tc>
+          <w:tcPr>
+            <w:tcW w:type="dxa" w:w="4320"/>
+          </w:tcPr>
+          <w:p>
+            <w:r/>
+            <w:r>
+              <w:rPr>
+                <w:rFonts w:ascii="Inconsolata" w:hAnsi="Inconsolata"/>
+                <w:sz w:val="20"/>
+              </w:rPr>
+              <w:t>0.00 (FAIL)</w:t>
+            </w:r>
+          </w:p>
+        </w:tc>
+      </w:tr>
+      <w:tr>
+        <w:tc>
+          <w:tcPr>
+            <w:tcW w:type="dxa" w:w="4320"/>
+          </w:tcPr>
+          <w:p>
+            <w:r/>
+            <w:r>
+              <w:rPr>
+                <w:rFonts w:ascii="Inconsolata" w:hAnsi="Inconsolata"/>
+                <w:sz w:val="20"/>
+              </w:rPr>
+              <w:t>Reasoning depth</w:t>
+            </w:r>
+          </w:p>
+        </w:tc>
+        <w:tc>
+          <w:tcPr>
+            <w:tcW w:type="dxa" w:w="4320"/>
+          </w:tcPr>
+          <w:p>
+            <w:r/>
+            <w:r>
+              <w:rPr>
+                <w:rFonts w:ascii="Inconsolata" w:hAnsi="Inconsolata"/>
+                <w:sz w:val="20"/>
+              </w:rPr>
+              <w:t>Clause Citations: YES, Conditional Analysis: YES, Actionable Steps: YES</w:t>
+            </w:r>
+          </w:p>
+        </w:tc>
+        <w:tc>
+          <w:tcPr>
+            <w:tcW w:type="dxa" w:w="4320"/>
+          </w:tcPr>
+          <w:p>
+            <w:r/>
+            <w:r>
+              <w:rPr>
+                <w:rFonts w:ascii="Inconsolata" w:hAnsi="Inconsolata"/>
+                <w:sz w:val="20"/>
+              </w:rPr>
+              <w:t>Clause Citations: NO, Conditional Analysis: NO, Actionable Steps: YES</w:t>
+            </w:r>
+          </w:p>
+        </w:tc>
+      </w:tr>
+      <w:tr>
+        <w:tc>
+          <w:tcPr>
+            <w:tcW w:type="dxa" w:w="4320"/>
+          </w:tcPr>
+          <w:p>
+            <w:r/>
+            <w:r>
+              <w:rPr>
+                <w:rFonts w:ascii="Inconsolata" w:hAnsi="Inconsolata"/>
+                <w:sz w:val="20"/>
+              </w:rPr>
+              <w:t>RAGAs score</w:t>
+            </w:r>
+          </w:p>
+        </w:tc>
+        <w:tc>
+          <w:tcPr>
+            <w:tcW w:type="dxa" w:w="4320"/>
+          </w:tcPr>
+          <w:p>
+            <w:r/>
+            <w:r>
+              <w:rPr>
+                <w:rFonts w:ascii="Inconsolata" w:hAnsi="Inconsolata"/>
+                <w:sz w:val="20"/>
+              </w:rPr>
+              <w:t>0.94</w:t>
+            </w:r>
+          </w:p>
+        </w:tc>
+        <w:tc>
+          <w:tcPr>
+            <w:tcW w:type="dxa" w:w="4320"/>
+          </w:tcPr>
+          <w:p>
+            <w:r/>
+            <w:r>
+              <w:rPr>
+                <w:rFonts w:ascii="Inconsolata" w:hAnsi="Inconsolata"/>
+                <w:sz w:val="20"/>
+              </w:rPr>
+              <w:t>0.50</w:t>
+            </w:r>
+          </w:p>
+        </w:tc>
+      </w:tr>
+      <w:tr>
+        <w:tc>
+          <w:tcPr>
+            <w:tcW w:type="dxa" w:w="4320"/>
+          </w:tcPr>
+          <w:p>
+            <w:r/>
+            <w:r>
+              <w:rPr>
+                <w:rFonts w:ascii="Inconsolata" w:hAnsi="Inconsolata"/>
+                <w:sz w:val="20"/>
+              </w:rPr>
+              <w:t>context_faithfulness</w:t>
+            </w:r>
+          </w:p>
+        </w:tc>
+        <w:tc>
+          <w:tcPr>
+            <w:tcW w:type="dxa" w:w="4320"/>
+          </w:tcPr>
+          <w:p>
+            <w:r/>
+            <w:r>
+              <w:rPr>
+                <w:rFonts w:ascii="Inconsolata" w:hAnsi="Inconsolata"/>
+                <w:sz w:val="20"/>
+              </w:rPr>
+              <w:t>0.80</w:t>
+            </w:r>
+          </w:p>
+        </w:tc>
+        <w:tc>
+          <w:tcPr>
+            <w:tcW w:type="dxa" w:w="4320"/>
+          </w:tcPr>
+          <w:p>
+            <w:r/>
+            <w:r>
+              <w:rPr>
+                <w:rFonts w:ascii="Inconsolata" w:hAnsi="Inconsolata"/>
+                <w:sz w:val="20"/>
+              </w:rPr>
+              <w:t>N/A</w:t>
+            </w:r>
+          </w:p>
+        </w:tc>
+      </w:tr>
+      <w:tr>
+        <w:tc>
+          <w:tcPr>
+            <w:tcW w:type="dxa" w:w="4320"/>
+          </w:tcPr>
+          <w:p>
+            <w:r/>
+            <w:r>
+              <w:rPr>
+                <w:rFonts w:ascii="Inconsolata" w:hAnsi="Inconsolata"/>
+                <w:sz w:val="20"/>
+              </w:rPr>
+              <w:t>factual_recall</w:t>
+            </w:r>
+          </w:p>
+        </w:tc>
+        <w:tc>
+          <w:tcPr>
+            <w:tcW w:type="dxa" w:w="4320"/>
+          </w:tcPr>
+          <w:p>
+            <w:r/>
+            <w:r>
+              <w:rPr>
+                <w:rFonts w:ascii="Inconsolata" w:hAnsi="Inconsolata"/>
+                <w:sz w:val="20"/>
+              </w:rPr>
+              <w:t>1.00</w:t>
+            </w:r>
+          </w:p>
+        </w:tc>
+        <w:tc>
+          <w:tcPr>
+            <w:tcW w:type="dxa" w:w="4320"/>
+          </w:tcPr>
+          <w:p>
+            <w:r/>
+            <w:r>
+              <w:rPr>
+                <w:rFonts w:ascii="Inconsolata" w:hAnsi="Inconsolata"/>
+                <w:sz w:val="20"/>
+              </w:rPr>
+              <w:t>0.62</w:t>
+            </w:r>
+          </w:p>
+        </w:tc>
+      </w:tr>
+      <w:tr>
+        <w:tc>
+          <w:tcPr>
+            <w:tcW w:type="dxa" w:w="4320"/>
+          </w:tcPr>
+          <w:p>
+            <w:r/>
+            <w:r>
+              <w:rPr>
+                <w:rFonts w:ascii="Inconsolata" w:hAnsi="Inconsolata"/>
+                <w:sz w:val="20"/>
+              </w:rPr>
+              <w:t>semantic_similarity</w:t>
+            </w:r>
+          </w:p>
+        </w:tc>
+        <w:tc>
+          <w:tcPr>
+            <w:tcW w:type="dxa" w:w="4320"/>
+          </w:tcPr>
+          <w:p>
+            <w:r/>
+            <w:r>
+              <w:rPr>
+                <w:rFonts w:ascii="Inconsolata" w:hAnsi="Inconsolata"/>
+                <w:sz w:val="20"/>
+              </w:rPr>
+              <w:t>0.90</w:t>
+            </w:r>
+          </w:p>
+        </w:tc>
+        <w:tc>
+          <w:tcPr>
+            <w:tcW w:type="dxa" w:w="4320"/>
+          </w:tcPr>
+          <w:p>
+            <w:r/>
+            <w:r>
+              <w:rPr>
+                <w:rFonts w:ascii="Inconsolata" w:hAnsi="Inconsolata"/>
+                <w:sz w:val="20"/>
+              </w:rPr>
+              <w:t>0.89</w:t>
+            </w:r>
+          </w:p>
+        </w:tc>
+      </w:tr>
+    </w:tbl>
+    <w:p>
+      <w:pPr/>
+      <w:r>
+        <w:rPr>
+          <w:rFonts w:ascii="Inconsolata" w:hAnsi="Inconsolata"/>
+          <w:sz w:val="26"/>
+        </w:rPr>
+        <w:t>The contrast is stark: the RAG-augmented response achieves perfect benchmark and factual recall scores by grounding its reasoning in retrieved clause text — it identifies the specific prohibition on shared accounts (5.2.1.c), the MFA requirement (5.3.1.c), and provides an actionable recommendation. The LLM-only response demonstrates high semantic similarity (0.89) — it discusses the right topic — but cannot cite specific clauses, fabricates "Clause 6.5", and produces a non-committal answer unsuitable for compliance guidance.</w:t>
+      </w:r>
+    </w:p>
+    <w:p>
+      <w:pPr>
         <w:pStyle w:val="Heading2"/>
       </w:pPr>
       <w:r>

</xml_diff>